<commit_message>
Actualizar resolución de conflictos LEX-CORPUS
</commit_message>
<xml_diff>
--- a/Fase 1/Evidencias de proyecto/Gestion de Proyecto/Resolucion_de_Conflictos_LEX-CORPUS.docx
+++ b/Fase 1/Evidencias de proyecto/Gestion de Proyecto/Resolucion_de_Conflictos_LEX-CORPUS.docx
@@ -4,27 +4,16 @@
   <w:body>
     <w:p>
       <w:pPr>
+        <w:pStyle w:val="Title"/>
         <w:jc w:val="center"/>
       </w:pPr>
       <w:r>
         <w:rPr>
-          <w:b/>
-          <w:color w:val="6B1F2A"/>
-          <w:sz w:val="40"/>
+          <w:rFonts w:ascii="Aptos Display" w:hAnsi="Aptos Display"/>
+          <w:color w:val="000000"/>
+          <w:sz w:val="44"/>
         </w:rPr>
-        <w:t>Resolución de Conflictos</w:t>
-      </w:r>
-    </w:p>
-    <w:p>
-      <w:pPr>
-        <w:jc w:val="center"/>
-      </w:pPr>
-      <w:r>
-        <w:rPr>
-          <w:b/>
-          <w:sz w:val="30"/>
-        </w:rPr>
-        <w:t>LEX-CORPUS</w:t>
+        <w:t>Resolución de conflictos</w:t>
       </w:r>
     </w:p>
     <w:p>
@@ -36,330 +25,15 @@
           <w:i/>
           <w:sz w:val="22"/>
         </w:rPr>
-        <w:t>Organización y comunicación para abogados de asistencia judicial</w:t>
+        <w:t>LEX-CORPUS  Organización y comunicación para abogados de asistencia judicial</w:t>
       </w:r>
     </w:p>
     <w:p>
       <w:pPr>
-        <w:jc w:val="center"/>
+        <w:spacing w:after="180"/>
       </w:pPr>
       <w:r>
-        <w:rPr>
-          <w:sz w:val="20"/>
-        </w:rPr>
-        <w:t>Fecha: 10-09-2026</w:t>
-      </w:r>
-    </w:p>
-    <w:p>
-      <w:pPr>
-        <w:jc w:val="center"/>
-      </w:pPr>
-      <w:r>
-        <w:rPr>
-          <w:sz w:val="20"/>
-        </w:rPr>
-        <w:t>Integrantes: Emerson Jiménez Loaiza / Natanael Labrea / Sebastián González</w:t>
-      </w:r>
-    </w:p>
-    <w:p>
-      <w:pPr>
-        <w:jc w:val="center"/>
-      </w:pPr>
-      <w:r>
-        <w:rPr>
-          <w:sz w:val="20"/>
-        </w:rPr>
-        <w:t>Docente: Luis Bravo</w:t>
-      </w:r>
-    </w:p>
-    <w:p/>
-    <w:tbl>
-      <w:tblPr>
-        <w:tblStyle w:val="TableGrid"/>
-        <w:tblW w:type="auto" w:w="0"/>
-        <w:jc w:val="center"/>
-        <w:tblLook w:firstColumn="1" w:firstRow="1" w:lastColumn="0" w:lastRow="0" w:noHBand="0" w:noVBand="1" w:val="04A0"/>
-      </w:tblPr>
-      <w:tblGrid>
-        <w:gridCol w:w="4320"/>
-        <w:gridCol w:w="4320"/>
-      </w:tblGrid>
-      <w:tr>
-        <w:tc>
-          <w:tcPr>
-            <w:tcW w:type="dxa" w:w="3402"/>
-            <w:shd w:val="clear" w:color="auto" w:fill="6B1F2A"/>
-          </w:tcPr>
-          <w:p>
-            <w:r/>
-            <w:r>
-              <w:rPr>
-                <w:b/>
-                <w:color w:val="FFFFFF"/>
-                <w:sz w:val="20"/>
-              </w:rPr>
-              <w:t>Campo</w:t>
-            </w:r>
-          </w:p>
-        </w:tc>
-        <w:tc>
-          <w:tcPr>
-            <w:tcW w:type="dxa" w:w="5669"/>
-            <w:shd w:val="clear" w:color="auto" w:fill="6B1F2A"/>
-          </w:tcPr>
-          <w:p>
-            <w:r/>
-            <w:r>
-              <w:rPr>
-                <w:b/>
-                <w:color w:val="FFFFFF"/>
-                <w:sz w:val="20"/>
-              </w:rPr>
-              <w:t>Detalle</w:t>
-            </w:r>
-          </w:p>
-        </w:tc>
-      </w:tr>
-      <w:tr>
-        <w:tc>
-          <w:tcPr>
-            <w:tcW w:type="dxa" w:w="3402"/>
-          </w:tcPr>
-          <w:p>
-            <w:r/>
-            <w:r>
-              <w:rPr>
-                <w:b w:val="0"/>
-                <w:sz w:val="20"/>
-              </w:rPr>
-              <w:t>Proyecto</w:t>
-            </w:r>
-          </w:p>
-        </w:tc>
-        <w:tc>
-          <w:tcPr>
-            <w:tcW w:type="dxa" w:w="5669"/>
-          </w:tcPr>
-          <w:p>
-            <w:r/>
-            <w:r>
-              <w:rPr>
-                <w:b w:val="0"/>
-                <w:sz w:val="20"/>
-              </w:rPr>
-              <w:t>LEX-CORPUS</w:t>
-            </w:r>
-          </w:p>
-        </w:tc>
-      </w:tr>
-      <w:tr>
-        <w:tc>
-          <w:tcPr>
-            <w:tcW w:type="dxa" w:w="3402"/>
-          </w:tcPr>
-          <w:p>
-            <w:r/>
-            <w:r>
-              <w:rPr>
-                <w:b w:val="0"/>
-                <w:sz w:val="20"/>
-              </w:rPr>
-              <w:t>Empresa / Organización</w:t>
-            </w:r>
-          </w:p>
-        </w:tc>
-        <w:tc>
-          <w:tcPr>
-            <w:tcW w:type="dxa" w:w="5669"/>
-          </w:tcPr>
-          <w:p>
-            <w:r/>
-            <w:r>
-              <w:rPr>
-                <w:b w:val="0"/>
-                <w:sz w:val="20"/>
-              </w:rPr>
-              <w:t>NikaTechSolutions</w:t>
-            </w:r>
-          </w:p>
-        </w:tc>
-      </w:tr>
-      <w:tr>
-        <w:tc>
-          <w:tcPr>
-            <w:tcW w:type="dxa" w:w="3402"/>
-          </w:tcPr>
-          <w:p>
-            <w:r/>
-            <w:r>
-              <w:rPr>
-                <w:b w:val="0"/>
-                <w:sz w:val="20"/>
-              </w:rPr>
-              <w:t>Cliente</w:t>
-            </w:r>
-          </w:p>
-        </w:tc>
-        <w:tc>
-          <w:tcPr>
-            <w:tcW w:type="dxa" w:w="5669"/>
-          </w:tcPr>
-          <w:p>
-            <w:r/>
-            <w:r>
-              <w:rPr>
-                <w:b w:val="0"/>
-                <w:sz w:val="20"/>
-              </w:rPr>
-              <w:t>CAJ / Abogados independientes</w:t>
-            </w:r>
-          </w:p>
-        </w:tc>
-      </w:tr>
-      <w:tr>
-        <w:tc>
-          <w:tcPr>
-            <w:tcW w:type="dxa" w:w="3402"/>
-          </w:tcPr>
-          <w:p>
-            <w:r/>
-            <w:r>
-              <w:rPr>
-                <w:b w:val="0"/>
-                <w:sz w:val="20"/>
-              </w:rPr>
-              <w:t>Patrocinador principal</w:t>
-            </w:r>
-          </w:p>
-        </w:tc>
-        <w:tc>
-          <w:tcPr>
-            <w:tcW w:type="dxa" w:w="5669"/>
-          </w:tcPr>
-          <w:p>
-            <w:r/>
-            <w:r>
-              <w:rPr>
-                <w:b w:val="0"/>
-                <w:sz w:val="20"/>
-              </w:rPr>
-              <w:t>Duoc UC</w:t>
-            </w:r>
-          </w:p>
-        </w:tc>
-      </w:tr>
-      <w:tr>
-        <w:tc>
-          <w:tcPr>
-            <w:tcW w:type="dxa" w:w="3402"/>
-          </w:tcPr>
-          <w:p>
-            <w:r/>
-            <w:r>
-              <w:rPr>
-                <w:b w:val="0"/>
-                <w:sz w:val="20"/>
-              </w:rPr>
-              <w:t>Equipo de desarrollo</w:t>
-            </w:r>
-          </w:p>
-        </w:tc>
-        <w:tc>
-          <w:tcPr>
-            <w:tcW w:type="dxa" w:w="5669"/>
-          </w:tcPr>
-          <w:p>
-            <w:r/>
-            <w:r>
-              <w:rPr>
-                <w:b w:val="0"/>
-                <w:sz w:val="20"/>
-              </w:rPr>
-              <w:t>Emerson Jiménez Loaiza / Natanael Labrea / Sebastián González</w:t>
-            </w:r>
-          </w:p>
-        </w:tc>
-      </w:tr>
-      <w:tr>
-        <w:tc>
-          <w:tcPr>
-            <w:tcW w:type="dxa" w:w="3402"/>
-          </w:tcPr>
-          <w:p>
-            <w:r/>
-            <w:r>
-              <w:rPr>
-                <w:b w:val="0"/>
-                <w:sz w:val="20"/>
-              </w:rPr>
-              <w:t>Docente / Evaluador</w:t>
-            </w:r>
-          </w:p>
-        </w:tc>
-        <w:tc>
-          <w:tcPr>
-            <w:tcW w:type="dxa" w:w="5669"/>
-          </w:tcPr>
-          <w:p>
-            <w:r/>
-            <w:r>
-              <w:rPr>
-                <w:b w:val="0"/>
-                <w:sz w:val="20"/>
-              </w:rPr>
-              <w:t>Luis Bravo</w:t>
-            </w:r>
-          </w:p>
-        </w:tc>
-      </w:tr>
-      <w:tr>
-        <w:tc>
-          <w:tcPr>
-            <w:tcW w:type="dxa" w:w="3402"/>
-          </w:tcPr>
-          <w:p>
-            <w:r/>
-            <w:r>
-              <w:rPr>
-                <w:b w:val="0"/>
-                <w:sz w:val="20"/>
-              </w:rPr>
-              <w:t>Fecha de preparación</w:t>
-            </w:r>
-          </w:p>
-        </w:tc>
-        <w:tc>
-          <w:tcPr>
-            <w:tcW w:type="dxa" w:w="5669"/>
-          </w:tcPr>
-          <w:p>
-            <w:r/>
-            <w:r>
-              <w:rPr>
-                <w:b w:val="0"/>
-                <w:sz w:val="20"/>
-              </w:rPr>
-              <w:t>10-09-2026</w:t>
-            </w:r>
-          </w:p>
-        </w:tc>
-      </w:tr>
-    </w:tbl>
-    <w:p/>
-    <w:p>
-      <w:pPr>
-        <w:pStyle w:val="Heading1"/>
-      </w:pPr>
-      <w:r>
-        <w:rPr>
-          <w:color w:val="6B1F2A"/>
-        </w:rPr>
-        <w:t>1. Objetivo</w:t>
-      </w:r>
-    </w:p>
-    <w:p>
-      <w:r>
-        <w:t>Definir un procedimiento claro para identificar, escalar y resolver los conflictos que puedan surgir durante el desarrollo del proyecto LEX-CORPUS, y dejar registro de ellos para trazabilidad.</w:t>
+        <w:t>Este protocolo define cómo el equipo identifica, registra y resuelve conflictos durante el proyecto. A la fecha de actualización, el equipo informa que no se han producido conflictos.</w:t>
       </w:r>
     </w:p>
     <w:p>
@@ -367,104 +41,7 @@
         <w:pStyle w:val="Heading1"/>
       </w:pPr>
       <w:r>
-        <w:rPr>
-          <w:color w:val="6B1F2A"/>
-        </w:rPr>
-        <w:t>2. Tipos de conflicto contemplados</w:t>
-      </w:r>
-    </w:p>
-    <w:p>
-      <w:pPr>
-        <w:pStyle w:val="ListBullet"/>
-      </w:pPr>
-      <w:r>
-        <w:t>Técnico: desacuerdos sobre decisiones de arquitectura, stack o implementación.</w:t>
-      </w:r>
-    </w:p>
-    <w:p>
-      <w:pPr>
-        <w:pStyle w:val="ListBullet"/>
-      </w:pPr>
-      <w:r>
-        <w:t>De alcance: cambios o ambigüedades sobre qué incluye o no una historia de usuario.</w:t>
-      </w:r>
-    </w:p>
-    <w:p>
-      <w:pPr>
-        <w:pStyle w:val="ListBullet"/>
-      </w:pPr>
-      <w:r>
-        <w:t>Interpersonal / de equipo: carga de trabajo desigual, comunicación o coordinación entre integrantes.</w:t>
-      </w:r>
-    </w:p>
-    <w:p>
-      <w:pPr>
-        <w:pStyle w:val="ListBullet"/>
-      </w:pPr>
-      <w:r>
-        <w:t>De cronograma: incumplimiento de plazos o compromisos de una iteración.</w:t>
-      </w:r>
-    </w:p>
-    <w:p>
-      <w:pPr>
-        <w:pStyle w:val="Heading1"/>
-      </w:pPr>
-      <w:r>
-        <w:rPr>
-          <w:color w:val="6B1F2A"/>
-        </w:rPr>
-        <w:t>3. Procedimiento de resolución</w:t>
-      </w:r>
-    </w:p>
-    <w:p>
-      <w:pPr>
-        <w:pStyle w:val="ListNumber"/>
-      </w:pPr>
-      <w:r>
-        <w:t>Identificación: cualquier integrante que detecte un conflicto lo plantea en la reunión de equipo más próxima, o de inmediato si es urgente.</w:t>
-      </w:r>
-    </w:p>
-    <w:p>
-      <w:pPr>
-        <w:pStyle w:val="ListNumber"/>
-      </w:pPr>
-      <w:r>
-        <w:t>Diálogo directo (Nivel 1): las partes involucradas intentan resolverlo directamente, en un plazo máximo de 2 días hábiles.</w:t>
-      </w:r>
-    </w:p>
-    <w:p>
-      <w:pPr>
-        <w:pStyle w:val="ListNumber"/>
-      </w:pPr>
-      <w:r>
-        <w:t>Reunión de equipo (Nivel 2): si no se resuelve, se agenda una reunión con el equipo completo; el acuerdo alcanzado queda documentado en un acta (ver "Plantilla de Actas de Reunión").</w:t>
-      </w:r>
-    </w:p>
-    <w:p>
-      <w:pPr>
-        <w:pStyle w:val="ListNumber"/>
-      </w:pPr>
-      <w:r>
-        <w:t>Escalamiento al docente guía (Nivel 3): si el conflicto afecta el cumplimiento del proyecto y el equipo no logra acuerdo, se escala a Luis Bravo (docente guía) como mediador.</w:t>
-      </w:r>
-    </w:p>
-    <w:p>
-      <w:pPr>
-        <w:pStyle w:val="ListNumber"/>
-      </w:pPr>
-      <w:r>
-        <w:t>Registro: todo conflicto, resuelto o no, queda anotado en la tabla de la sección 5 de este documento.</w:t>
-      </w:r>
-    </w:p>
-    <w:p>
-      <w:pPr>
-        <w:pStyle w:val="Heading1"/>
-      </w:pPr>
-      <w:r>
-        <w:rPr>
-          <w:color w:val="6B1F2A"/>
-        </w:rPr>
-        <w:t>4. Matriz de escalamiento</w:t>
+        <w:t>Datos del proyecto</w:t>
       </w:r>
     </w:p>
     <w:tbl>
@@ -475,278 +52,610 @@
         <w:tblLook w:firstColumn="1" w:firstRow="1" w:lastColumn="0" w:lastRow="0" w:noHBand="0" w:noVBand="1" w:val="04A0"/>
       </w:tblPr>
       <w:tblGrid>
-        <w:gridCol w:w="2160"/>
-        <w:gridCol w:w="2160"/>
-        <w:gridCol w:w="2160"/>
-        <w:gridCol w:w="2160"/>
+        <w:gridCol w:w="5112"/>
+        <w:gridCol w:w="5112"/>
       </w:tblGrid>
       <w:tr>
+        <w:trPr>
+          <w:cantSplit/>
+          <w:tblHeader w:val="true"/>
+        </w:trPr>
         <w:tc>
           <w:tcPr>
-            <w:tcW w:type="dxa" w:w="2160"/>
-            <w:shd w:val="clear" w:color="auto" w:fill="6B1F2A"/>
+            <w:tcW w:type="dxa" w:w="2952"/>
+            <w:vAlign w:val="center"/>
+            <w:tcBorders>
+              <w:top w:val="single" w:sz="4" w:color="D9D9D9"/>
+              <w:left w:val="single" w:sz="4" w:color="D9D9D9"/>
+              <w:bottom w:val="single" w:sz="4" w:color="D9D9D9"/>
+              <w:right w:val="single" w:sz="4" w:color="D9D9D9"/>
+              <w:insideH w:val="single" w:sz="4" w:color="D9D9D9"/>
+              <w:insideV w:val="single" w:sz="4" w:color="D9D9D9"/>
+            </w:tcBorders>
+            <w:shd w:fill="17365D"/>
           </w:tcPr>
           <w:p>
-            <w:r/>
+            <w:pPr>
+              <w:spacing w:after="0" w:before="0"/>
+              <w:jc w:val="center"/>
+            </w:pPr>
             <w:r>
               <w:rPr>
+                <w:color w:val="FFFFFF"/>
+              </w:rPr>
+            </w:r>
+            <w:r>
+              <w:rPr>
+                <w:rFonts w:ascii="Aptos" w:hAnsi="Aptos"/>
                 <w:b/>
                 <w:color w:val="FFFFFF"/>
-                <w:sz w:val="20"/>
+                <w:sz w:val="19"/>
               </w:rPr>
-              <w:t>Nivel</w:t>
+              <w:t>Campo</w:t>
             </w:r>
           </w:p>
         </w:tc>
         <w:tc>
           <w:tcPr>
-            <w:tcW w:type="dxa" w:w="2160"/>
-            <w:shd w:val="clear" w:color="auto" w:fill="6B1F2A"/>
+            <w:tcW w:type="dxa" w:w="6552"/>
+            <w:vAlign w:val="center"/>
+            <w:tcBorders>
+              <w:top w:val="single" w:sz="4" w:color="D9D9D9"/>
+              <w:left w:val="single" w:sz="4" w:color="D9D9D9"/>
+              <w:bottom w:val="single" w:sz="4" w:color="D9D9D9"/>
+              <w:right w:val="single" w:sz="4" w:color="D9D9D9"/>
+              <w:insideH w:val="single" w:sz="4" w:color="D9D9D9"/>
+              <w:insideV w:val="single" w:sz="4" w:color="D9D9D9"/>
+            </w:tcBorders>
+            <w:shd w:fill="17365D"/>
           </w:tcPr>
           <w:p>
+            <w:pPr>
+              <w:spacing w:after="0" w:before="0"/>
+              <w:jc w:val="center"/>
+            </w:pPr>
+            <w:r>
+              <w:rPr>
+                <w:color w:val="FFFFFF"/>
+              </w:rPr>
+            </w:r>
+            <w:r>
+              <w:rPr>
+                <w:rFonts w:ascii="Aptos" w:hAnsi="Aptos"/>
+                <w:b/>
+                <w:color w:val="FFFFFF"/>
+                <w:sz w:val="19"/>
+              </w:rPr>
+              <w:t>Detalle</w:t>
+            </w:r>
+          </w:p>
+        </w:tc>
+      </w:tr>
+      <w:tr>
+        <w:trPr>
+          <w:cantSplit/>
+        </w:trPr>
+        <w:tc>
+          <w:tcPr>
+            <w:tcW w:type="dxa" w:w="2952"/>
+            <w:vAlign w:val="center"/>
+            <w:tcBorders>
+              <w:top w:val="single" w:sz="4" w:color="D9D9D9"/>
+              <w:left w:val="single" w:sz="4" w:color="D9D9D9"/>
+              <w:bottom w:val="single" w:sz="4" w:color="D9D9D9"/>
+              <w:right w:val="single" w:sz="4" w:color="D9D9D9"/>
+              <w:insideH w:val="single" w:sz="4" w:color="D9D9D9"/>
+              <w:insideV w:val="single" w:sz="4" w:color="D9D9D9"/>
+            </w:tcBorders>
+          </w:tcPr>
+          <w:p>
+            <w:pPr>
+              <w:spacing w:after="0" w:before="0"/>
+              <w:jc w:val="center"/>
+            </w:pPr>
             <w:r/>
             <w:r>
               <w:rPr>
-                <w:b/>
-                <w:color w:val="FFFFFF"/>
-                <w:sz w:val="20"/>
+                <w:rFonts w:ascii="Aptos" w:hAnsi="Aptos"/>
+                <w:b w:val="0"/>
+                <w:sz w:val="19"/>
               </w:rPr>
-              <w:t>Instancia</w:t>
+              <w:t>Proyecto</w:t>
             </w:r>
           </w:p>
         </w:tc>
         <w:tc>
           <w:tcPr>
-            <w:tcW w:type="dxa" w:w="2160"/>
-            <w:shd w:val="clear" w:color="auto" w:fill="6B1F2A"/>
+            <w:tcW w:type="dxa" w:w="6552"/>
+            <w:vAlign w:val="center"/>
+            <w:tcBorders>
+              <w:top w:val="single" w:sz="4" w:color="D9D9D9"/>
+              <w:left w:val="single" w:sz="4" w:color="D9D9D9"/>
+              <w:bottom w:val="single" w:sz="4" w:color="D9D9D9"/>
+              <w:right w:val="single" w:sz="4" w:color="D9D9D9"/>
+              <w:insideH w:val="single" w:sz="4" w:color="D9D9D9"/>
+              <w:insideV w:val="single" w:sz="4" w:color="D9D9D9"/>
+            </w:tcBorders>
           </w:tcPr>
           <w:p>
+            <w:pPr>
+              <w:spacing w:after="0" w:before="0"/>
+              <w:jc w:val="left"/>
+            </w:pPr>
             <w:r/>
             <w:r>
               <w:rPr>
-                <w:b/>
-                <w:color w:val="FFFFFF"/>
-                <w:sz w:val="20"/>
+                <w:rFonts w:ascii="Aptos" w:hAnsi="Aptos"/>
+                <w:b w:val="0"/>
+                <w:sz w:val="19"/>
               </w:rPr>
-              <w:t>Responsable</w:t>
+              <w:t>LEX-CORPUS</w:t>
+            </w:r>
+          </w:p>
+        </w:tc>
+      </w:tr>
+      <w:tr>
+        <w:trPr>
+          <w:cantSplit/>
+        </w:trPr>
+        <w:tc>
+          <w:tcPr>
+            <w:tcW w:type="dxa" w:w="2952"/>
+            <w:vAlign w:val="center"/>
+            <w:tcBorders>
+              <w:top w:val="single" w:sz="4" w:color="D9D9D9"/>
+              <w:left w:val="single" w:sz="4" w:color="D9D9D9"/>
+              <w:bottom w:val="single" w:sz="4" w:color="D9D9D9"/>
+              <w:right w:val="single" w:sz="4" w:color="D9D9D9"/>
+              <w:insideH w:val="single" w:sz="4" w:color="D9D9D9"/>
+              <w:insideV w:val="single" w:sz="4" w:color="D9D9D9"/>
+            </w:tcBorders>
+            <w:shd w:fill="F5F9FC"/>
+          </w:tcPr>
+          <w:p>
+            <w:pPr>
+              <w:spacing w:after="0" w:before="0"/>
+              <w:jc w:val="left"/>
+            </w:pPr>
+            <w:r/>
+            <w:r>
+              <w:rPr>
+                <w:rFonts w:ascii="Aptos" w:hAnsi="Aptos"/>
+                <w:b w:val="0"/>
+                <w:sz w:val="19"/>
+              </w:rPr>
+              <w:t>Empresa u organización</w:t>
             </w:r>
           </w:p>
         </w:tc>
         <w:tc>
           <w:tcPr>
-            <w:tcW w:type="dxa" w:w="2160"/>
-            <w:shd w:val="clear" w:color="auto" w:fill="6B1F2A"/>
+            <w:tcW w:type="dxa" w:w="6552"/>
+            <w:vAlign w:val="center"/>
+            <w:tcBorders>
+              <w:top w:val="single" w:sz="4" w:color="D9D9D9"/>
+              <w:left w:val="single" w:sz="4" w:color="D9D9D9"/>
+              <w:bottom w:val="single" w:sz="4" w:color="D9D9D9"/>
+              <w:right w:val="single" w:sz="4" w:color="D9D9D9"/>
+              <w:insideH w:val="single" w:sz="4" w:color="D9D9D9"/>
+              <w:insideV w:val="single" w:sz="4" w:color="D9D9D9"/>
+            </w:tcBorders>
+            <w:shd w:fill="F5F9FC"/>
           </w:tcPr>
           <w:p>
+            <w:pPr>
+              <w:spacing w:after="0" w:before="0"/>
+              <w:jc w:val="left"/>
+            </w:pPr>
             <w:r/>
             <w:r>
               <w:rPr>
-                <w:b/>
-                <w:color w:val="FFFFFF"/>
-                <w:sz w:val="20"/>
+                <w:rFonts w:ascii="Aptos" w:hAnsi="Aptos"/>
+                <w:b w:val="0"/>
+                <w:sz w:val="19"/>
               </w:rPr>
-              <w:t>Plazo sugerido</w:t>
+              <w:t>NikaTechSolutions</w:t>
             </w:r>
           </w:p>
         </w:tc>
       </w:tr>
       <w:tr>
+        <w:trPr>
+          <w:cantSplit/>
+        </w:trPr>
         <w:tc>
           <w:tcPr>
-            <w:tcW w:type="dxa" w:w="2160"/>
+            <w:tcW w:type="dxa" w:w="2952"/>
+            <w:vAlign w:val="center"/>
+            <w:tcBorders>
+              <w:top w:val="single" w:sz="4" w:color="D9D9D9"/>
+              <w:left w:val="single" w:sz="4" w:color="D9D9D9"/>
+              <w:bottom w:val="single" w:sz="4" w:color="D9D9D9"/>
+              <w:right w:val="single" w:sz="4" w:color="D9D9D9"/>
+              <w:insideH w:val="single" w:sz="4" w:color="D9D9D9"/>
+              <w:insideV w:val="single" w:sz="4" w:color="D9D9D9"/>
+            </w:tcBorders>
           </w:tcPr>
           <w:p>
+            <w:pPr>
+              <w:spacing w:after="0" w:before="0"/>
+              <w:jc w:val="center"/>
+            </w:pPr>
             <w:r/>
             <w:r>
               <w:rPr>
+                <w:rFonts w:ascii="Aptos" w:hAnsi="Aptos"/>
                 <w:b w:val="0"/>
-                <w:sz w:val="20"/>
+                <w:sz w:val="19"/>
               </w:rPr>
-              <w:t>1</w:t>
+              <w:t>Cliente</w:t>
             </w:r>
           </w:p>
         </w:tc>
         <w:tc>
           <w:tcPr>
-            <w:tcW w:type="dxa" w:w="2160"/>
+            <w:tcW w:type="dxa" w:w="6552"/>
+            <w:vAlign w:val="center"/>
+            <w:tcBorders>
+              <w:top w:val="single" w:sz="4" w:color="D9D9D9"/>
+              <w:left w:val="single" w:sz="4" w:color="D9D9D9"/>
+              <w:bottom w:val="single" w:sz="4" w:color="D9D9D9"/>
+              <w:right w:val="single" w:sz="4" w:color="D9D9D9"/>
+              <w:insideH w:val="single" w:sz="4" w:color="D9D9D9"/>
+              <w:insideV w:val="single" w:sz="4" w:color="D9D9D9"/>
+            </w:tcBorders>
           </w:tcPr>
           <w:p>
+            <w:pPr>
+              <w:spacing w:after="0" w:before="0"/>
+              <w:jc w:val="left"/>
+            </w:pPr>
             <w:r/>
             <w:r>
               <w:rPr>
+                <w:rFonts w:ascii="Aptos" w:hAnsi="Aptos"/>
                 <w:b w:val="0"/>
-                <w:sz w:val="20"/>
+                <w:sz w:val="19"/>
               </w:rPr>
-              <w:t>Diálogo directo entre las partes</w:t>
+              <w:t>CAJ y abogados independientes</w:t>
+            </w:r>
+          </w:p>
+        </w:tc>
+      </w:tr>
+      <w:tr>
+        <w:trPr>
+          <w:cantSplit/>
+        </w:trPr>
+        <w:tc>
+          <w:tcPr>
+            <w:tcW w:type="dxa" w:w="2952"/>
+            <w:vAlign w:val="center"/>
+            <w:tcBorders>
+              <w:top w:val="single" w:sz="4" w:color="D9D9D9"/>
+              <w:left w:val="single" w:sz="4" w:color="D9D9D9"/>
+              <w:bottom w:val="single" w:sz="4" w:color="D9D9D9"/>
+              <w:right w:val="single" w:sz="4" w:color="D9D9D9"/>
+              <w:insideH w:val="single" w:sz="4" w:color="D9D9D9"/>
+              <w:insideV w:val="single" w:sz="4" w:color="D9D9D9"/>
+            </w:tcBorders>
+            <w:shd w:fill="F5F9FC"/>
+          </w:tcPr>
+          <w:p>
+            <w:pPr>
+              <w:spacing w:after="0" w:before="0"/>
+              <w:jc w:val="left"/>
+            </w:pPr>
+            <w:r/>
+            <w:r>
+              <w:rPr>
+                <w:rFonts w:ascii="Aptos" w:hAnsi="Aptos"/>
+                <w:b w:val="0"/>
+                <w:sz w:val="19"/>
+              </w:rPr>
+              <w:t>Patrocinador principal</w:t>
             </w:r>
           </w:p>
         </w:tc>
         <w:tc>
           <w:tcPr>
-            <w:tcW w:type="dxa" w:w="2160"/>
+            <w:tcW w:type="dxa" w:w="6552"/>
+            <w:vAlign w:val="center"/>
+            <w:tcBorders>
+              <w:top w:val="single" w:sz="4" w:color="D9D9D9"/>
+              <w:left w:val="single" w:sz="4" w:color="D9D9D9"/>
+              <w:bottom w:val="single" w:sz="4" w:color="D9D9D9"/>
+              <w:right w:val="single" w:sz="4" w:color="D9D9D9"/>
+              <w:insideH w:val="single" w:sz="4" w:color="D9D9D9"/>
+              <w:insideV w:val="single" w:sz="4" w:color="D9D9D9"/>
+            </w:tcBorders>
+            <w:shd w:fill="F5F9FC"/>
           </w:tcPr>
           <w:p>
+            <w:pPr>
+              <w:spacing w:after="0" w:before="0"/>
+              <w:jc w:val="left"/>
+            </w:pPr>
             <w:r/>
             <w:r>
               <w:rPr>
+                <w:rFonts w:ascii="Aptos" w:hAnsi="Aptos"/>
                 <w:b w:val="0"/>
-                <w:sz w:val="20"/>
+                <w:sz w:val="19"/>
               </w:rPr>
-              <w:t>Integrantes involucrados</w:t>
+              <w:t>Duoc UC</w:t>
+            </w:r>
+          </w:p>
+        </w:tc>
+      </w:tr>
+      <w:tr>
+        <w:trPr>
+          <w:cantSplit/>
+        </w:trPr>
+        <w:tc>
+          <w:tcPr>
+            <w:tcW w:type="dxa" w:w="2952"/>
+            <w:vAlign w:val="center"/>
+            <w:tcBorders>
+              <w:top w:val="single" w:sz="4" w:color="D9D9D9"/>
+              <w:left w:val="single" w:sz="4" w:color="D9D9D9"/>
+              <w:bottom w:val="single" w:sz="4" w:color="D9D9D9"/>
+              <w:right w:val="single" w:sz="4" w:color="D9D9D9"/>
+              <w:insideH w:val="single" w:sz="4" w:color="D9D9D9"/>
+              <w:insideV w:val="single" w:sz="4" w:color="D9D9D9"/>
+            </w:tcBorders>
+          </w:tcPr>
+          <w:p>
+            <w:pPr>
+              <w:spacing w:after="0" w:before="0"/>
+              <w:jc w:val="left"/>
+            </w:pPr>
+            <w:r/>
+            <w:r>
+              <w:rPr>
+                <w:rFonts w:ascii="Aptos" w:hAnsi="Aptos"/>
+                <w:b w:val="0"/>
+                <w:sz w:val="19"/>
+              </w:rPr>
+              <w:t>Equipo de desarrollo</w:t>
             </w:r>
           </w:p>
         </w:tc>
         <w:tc>
           <w:tcPr>
-            <w:tcW w:type="dxa" w:w="2160"/>
+            <w:tcW w:type="dxa" w:w="6552"/>
+            <w:vAlign w:val="center"/>
+            <w:tcBorders>
+              <w:top w:val="single" w:sz="4" w:color="D9D9D9"/>
+              <w:left w:val="single" w:sz="4" w:color="D9D9D9"/>
+              <w:bottom w:val="single" w:sz="4" w:color="D9D9D9"/>
+              <w:right w:val="single" w:sz="4" w:color="D9D9D9"/>
+              <w:insideH w:val="single" w:sz="4" w:color="D9D9D9"/>
+              <w:insideV w:val="single" w:sz="4" w:color="D9D9D9"/>
+            </w:tcBorders>
           </w:tcPr>
           <w:p>
+            <w:pPr>
+              <w:spacing w:after="0" w:before="0"/>
+              <w:jc w:val="left"/>
+            </w:pPr>
             <w:r/>
             <w:r>
               <w:rPr>
+                <w:rFonts w:ascii="Aptos" w:hAnsi="Aptos"/>
                 <w:b w:val="0"/>
-                <w:sz w:val="20"/>
+                <w:sz w:val="19"/>
               </w:rPr>
-              <w:t>2 días hábiles</w:t>
+              <w:t>Emerson Jiménez Loaiza, Natanael Labrea y Sebastián González</w:t>
             </w:r>
           </w:p>
         </w:tc>
       </w:tr>
       <w:tr>
+        <w:trPr>
+          <w:cantSplit/>
+        </w:trPr>
         <w:tc>
           <w:tcPr>
-            <w:tcW w:type="dxa" w:w="2160"/>
+            <w:tcW w:type="dxa" w:w="2952"/>
+            <w:vAlign w:val="center"/>
+            <w:tcBorders>
+              <w:top w:val="single" w:sz="4" w:color="D9D9D9"/>
+              <w:left w:val="single" w:sz="4" w:color="D9D9D9"/>
+              <w:bottom w:val="single" w:sz="4" w:color="D9D9D9"/>
+              <w:right w:val="single" w:sz="4" w:color="D9D9D9"/>
+              <w:insideH w:val="single" w:sz="4" w:color="D9D9D9"/>
+              <w:insideV w:val="single" w:sz="4" w:color="D9D9D9"/>
+            </w:tcBorders>
+            <w:shd w:fill="F5F9FC"/>
           </w:tcPr>
           <w:p>
+            <w:pPr>
+              <w:spacing w:after="0" w:before="0"/>
+              <w:jc w:val="left"/>
+            </w:pPr>
             <w:r/>
             <w:r>
               <w:rPr>
+                <w:rFonts w:ascii="Aptos" w:hAnsi="Aptos"/>
                 <w:b w:val="0"/>
-                <w:sz w:val="20"/>
+                <w:sz w:val="19"/>
               </w:rPr>
-              <w:t>2</w:t>
+              <w:t>Docente y evaluador</w:t>
             </w:r>
           </w:p>
         </w:tc>
         <w:tc>
           <w:tcPr>
-            <w:tcW w:type="dxa" w:w="2160"/>
+            <w:tcW w:type="dxa" w:w="6552"/>
+            <w:vAlign w:val="center"/>
+            <w:tcBorders>
+              <w:top w:val="single" w:sz="4" w:color="D9D9D9"/>
+              <w:left w:val="single" w:sz="4" w:color="D9D9D9"/>
+              <w:bottom w:val="single" w:sz="4" w:color="D9D9D9"/>
+              <w:right w:val="single" w:sz="4" w:color="D9D9D9"/>
+              <w:insideH w:val="single" w:sz="4" w:color="D9D9D9"/>
+              <w:insideV w:val="single" w:sz="4" w:color="D9D9D9"/>
+            </w:tcBorders>
+            <w:shd w:fill="F5F9FC"/>
           </w:tcPr>
           <w:p>
+            <w:pPr>
+              <w:spacing w:after="0" w:before="0"/>
+              <w:jc w:val="left"/>
+            </w:pPr>
             <w:r/>
             <w:r>
               <w:rPr>
+                <w:rFonts w:ascii="Aptos" w:hAnsi="Aptos"/>
                 <w:b w:val="0"/>
-                <w:sz w:val="20"/>
+                <w:sz w:val="19"/>
               </w:rPr>
-              <w:t>Reunión de equipo completo</w:t>
+              <w:t>Luis Bravo</w:t>
+            </w:r>
+          </w:p>
+        </w:tc>
+      </w:tr>
+      <w:tr>
+        <w:trPr>
+          <w:cantSplit/>
+        </w:trPr>
+        <w:tc>
+          <w:tcPr>
+            <w:tcW w:type="dxa" w:w="2952"/>
+            <w:vAlign w:val="center"/>
+            <w:tcBorders>
+              <w:top w:val="single" w:sz="4" w:color="D9D9D9"/>
+              <w:left w:val="single" w:sz="4" w:color="D9D9D9"/>
+              <w:bottom w:val="single" w:sz="4" w:color="D9D9D9"/>
+              <w:right w:val="single" w:sz="4" w:color="D9D9D9"/>
+              <w:insideH w:val="single" w:sz="4" w:color="D9D9D9"/>
+              <w:insideV w:val="single" w:sz="4" w:color="D9D9D9"/>
+            </w:tcBorders>
+          </w:tcPr>
+          <w:p>
+            <w:pPr>
+              <w:spacing w:after="0" w:before="0"/>
+              <w:jc w:val="left"/>
+            </w:pPr>
+            <w:r/>
+            <w:r>
+              <w:rPr>
+                <w:rFonts w:ascii="Aptos" w:hAnsi="Aptos"/>
+                <w:b w:val="0"/>
+                <w:sz w:val="19"/>
+              </w:rPr>
+              <w:t>Fecha de actualización</w:t>
             </w:r>
           </w:p>
         </w:tc>
         <w:tc>
           <w:tcPr>
-            <w:tcW w:type="dxa" w:w="2160"/>
+            <w:tcW w:type="dxa" w:w="6552"/>
+            <w:vAlign w:val="center"/>
+            <w:tcBorders>
+              <w:top w:val="single" w:sz="4" w:color="D9D9D9"/>
+              <w:left w:val="single" w:sz="4" w:color="D9D9D9"/>
+              <w:bottom w:val="single" w:sz="4" w:color="D9D9D9"/>
+              <w:right w:val="single" w:sz="4" w:color="D9D9D9"/>
+              <w:insideH w:val="single" w:sz="4" w:color="D9D9D9"/>
+              <w:insideV w:val="single" w:sz="4" w:color="D9D9D9"/>
+            </w:tcBorders>
           </w:tcPr>
           <w:p>
+            <w:pPr>
+              <w:spacing w:after="0" w:before="0"/>
+              <w:jc w:val="left"/>
+            </w:pPr>
             <w:r/>
             <w:r>
               <w:rPr>
+                <w:rFonts w:ascii="Aptos" w:hAnsi="Aptos"/>
                 <w:b w:val="0"/>
-                <w:sz w:val="20"/>
+                <w:sz w:val="19"/>
               </w:rPr>
-              <w:t>Todo el equipo</w:t>
-            </w:r>
-          </w:p>
-        </w:tc>
-        <w:tc>
-          <w:tcPr>
-            <w:tcW w:type="dxa" w:w="2160"/>
-          </w:tcPr>
-          <w:p>
-            <w:r/>
-            <w:r>
-              <w:rPr>
-                <w:b w:val="0"/>
-                <w:sz w:val="20"/>
-              </w:rPr>
-              <w:t>1 semana</w:t>
-            </w:r>
-          </w:p>
-        </w:tc>
-      </w:tr>
-      <w:tr>
-        <w:tc>
-          <w:tcPr>
-            <w:tcW w:type="dxa" w:w="2160"/>
-          </w:tcPr>
-          <w:p>
-            <w:r/>
-            <w:r>
-              <w:rPr>
-                <w:b w:val="0"/>
-                <w:sz w:val="20"/>
-              </w:rPr>
-              <w:t>3</w:t>
-            </w:r>
-          </w:p>
-        </w:tc>
-        <w:tc>
-          <w:tcPr>
-            <w:tcW w:type="dxa" w:w="2160"/>
-          </w:tcPr>
-          <w:p>
-            <w:r/>
-            <w:r>
-              <w:rPr>
-                <w:b w:val="0"/>
-                <w:sz w:val="20"/>
-              </w:rPr>
-              <w:t>Mediación del docente guía</w:t>
-            </w:r>
-          </w:p>
-        </w:tc>
-        <w:tc>
-          <w:tcPr>
-            <w:tcW w:type="dxa" w:w="2160"/>
-          </w:tcPr>
-          <w:p>
-            <w:r/>
-            <w:r>
-              <w:rPr>
-                <w:b w:val="0"/>
-                <w:sz w:val="20"/>
-              </w:rPr>
-              <w:t>Luis Bravo</w:t>
-            </w:r>
-          </w:p>
-        </w:tc>
-        <w:tc>
-          <w:tcPr>
-            <w:tcW w:type="dxa" w:w="2160"/>
-          </w:tcPr>
-          <w:p>
-            <w:r/>
-            <w:r>
-              <w:rPr>
-                <w:b w:val="0"/>
-                <w:sz w:val="20"/>
-              </w:rPr>
-              <w:t>Según disponibilidad del docente</w:t>
+              <w:t>11 de septiembre de 2026</w:t>
             </w:r>
           </w:p>
         </w:tc>
       </w:tr>
     </w:tbl>
-    <w:p/>
+    <w:p>
+      <w:pPr>
+        <w:spacing w:after="40"/>
+      </w:pPr>
+    </w:p>
     <w:p>
       <w:pPr>
         <w:pStyle w:val="Heading1"/>
       </w:pPr>
       <w:r>
-        <w:rPr>
-          <w:color w:val="6B1F2A"/>
-        </w:rPr>
-        <w:t>5. Registro de conflictos</w:t>
+        <w:t>Estado actual del corte</w:t>
+      </w:r>
+    </w:p>
+    <w:p>
+      <w:r>
+        <w:t>En la reunión inicial con el cliente del 7 de septiembre de 2026 no se reportaron conflictos. La definición del diagrama de base de datos y de los requisitos de seguridad permanece como pendiente técnico y riesgo de planificación; no se registra como conflicto mientras no exista un desacuerdo entre las partes o un impacto que requiera aplicar este protocolo.</w:t>
+      </w:r>
+    </w:p>
+    <w:p>
+      <w:pPr>
+        <w:pStyle w:val="Heading1"/>
+      </w:pPr>
+      <w:r>
+        <w:t>Objetivo</w:t>
+      </w:r>
+    </w:p>
+    <w:p>
+      <w:r>
+        <w:t>Establecer un procedimiento claro para abordar conflictos técnicos, de alcance, de coordinación o de cronograma. Toda resolución debe quedar registrada para que el equipo pueda verificar el acuerdo y evitar que el problema se repita.</w:t>
+      </w:r>
+    </w:p>
+    <w:p>
+      <w:pPr>
+        <w:pStyle w:val="Heading1"/>
+      </w:pPr>
+      <w:r>
+        <w:t>Tipos de conflicto contemplados</w:t>
+      </w:r>
+    </w:p>
+    <w:p>
+      <w:pPr>
+        <w:pStyle w:val="ListBullet"/>
+      </w:pPr>
+      <w:r>
+        <w:t>Técnico: desacuerdos sobre arquitectura, herramientas, integración o implementación.</w:t>
+      </w:r>
+    </w:p>
+    <w:p>
+      <w:pPr>
+        <w:pStyle w:val="ListBullet"/>
+      </w:pPr>
+      <w:r>
+        <w:t>De alcance: cambios, ambigüedades o interpretaciones distintas sobre una historia de usuario.</w:t>
+      </w:r>
+    </w:p>
+    <w:p>
+      <w:pPr>
+        <w:pStyle w:val="ListBullet"/>
+      </w:pPr>
+      <w:r>
+        <w:t>Interpersonal o de equipo: distribución de carga, comunicación, disponibilidad o coordinación.</w:t>
+      </w:r>
+    </w:p>
+    <w:p>
+      <w:pPr>
+        <w:pStyle w:val="ListBullet"/>
+      </w:pPr>
+      <w:r>
+        <w:t>De cronograma: incumplimientos que comprometen entregables, iteraciones o fechas acordadas.</w:t>
+      </w:r>
+    </w:p>
+    <w:p>
+      <w:pPr>
+        <w:pStyle w:val="Heading1"/>
+      </w:pPr>
+      <w:r>
+        <w:t>Procedimiento de resolución</w:t>
       </w:r>
     </w:p>
     <w:tbl>
@@ -757,28 +666,1211 @@
         <w:tblLook w:firstColumn="1" w:firstRow="1" w:lastColumn="0" w:lastRow="0" w:noHBand="0" w:noVBand="1" w:val="04A0"/>
       </w:tblPr>
       <w:tblGrid>
-        <w:gridCol w:w="1080"/>
-        <w:gridCol w:w="1080"/>
-        <w:gridCol w:w="1080"/>
-        <w:gridCol w:w="1080"/>
-        <w:gridCol w:w="1080"/>
-        <w:gridCol w:w="1080"/>
-        <w:gridCol w:w="1080"/>
-        <w:gridCol w:w="1080"/>
+        <w:gridCol w:w="3408"/>
+        <w:gridCol w:w="3408"/>
+        <w:gridCol w:w="3408"/>
       </w:tblGrid>
       <w:tr>
+        <w:trPr>
+          <w:cantSplit/>
+          <w:tblHeader w:val="true"/>
+        </w:trPr>
         <w:tc>
           <w:tcPr>
-            <w:tcW w:type="dxa" w:w="1080"/>
-            <w:shd w:val="clear" w:color="auto" w:fill="6B1F2A"/>
+            <w:tcW w:type="dxa" w:w="1728"/>
+            <w:vAlign w:val="center"/>
+            <w:tcBorders>
+              <w:top w:val="single" w:sz="4" w:color="D9D9D9"/>
+              <w:left w:val="single" w:sz="4" w:color="D9D9D9"/>
+              <w:bottom w:val="single" w:sz="4" w:color="D9D9D9"/>
+              <w:right w:val="single" w:sz="4" w:color="D9D9D9"/>
+              <w:insideH w:val="single" w:sz="4" w:color="D9D9D9"/>
+              <w:insideV w:val="single" w:sz="4" w:color="D9D9D9"/>
+            </w:tcBorders>
+            <w:shd w:fill="17365D"/>
           </w:tcPr>
           <w:p>
+            <w:pPr>
+              <w:spacing w:after="0" w:before="0"/>
+              <w:jc w:val="center"/>
+            </w:pPr>
+            <w:r>
+              <w:rPr>
+                <w:color w:val="FFFFFF"/>
+              </w:rPr>
+            </w:r>
+            <w:r>
+              <w:rPr>
+                <w:rFonts w:ascii="Aptos" w:hAnsi="Aptos"/>
+                <w:b/>
+                <w:color w:val="FFFFFF"/>
+                <w:sz w:val="19"/>
+              </w:rPr>
+              <w:t>Etapa</w:t>
+            </w:r>
+          </w:p>
+        </w:tc>
+        <w:tc>
+          <w:tcPr>
+            <w:tcW w:type="dxa" w:w="4464"/>
+            <w:vAlign w:val="center"/>
+            <w:tcBorders>
+              <w:top w:val="single" w:sz="4" w:color="D9D9D9"/>
+              <w:left w:val="single" w:sz="4" w:color="D9D9D9"/>
+              <w:bottom w:val="single" w:sz="4" w:color="D9D9D9"/>
+              <w:right w:val="single" w:sz="4" w:color="D9D9D9"/>
+              <w:insideH w:val="single" w:sz="4" w:color="D9D9D9"/>
+              <w:insideV w:val="single" w:sz="4" w:color="D9D9D9"/>
+            </w:tcBorders>
+            <w:shd w:fill="17365D"/>
+          </w:tcPr>
+          <w:p>
+            <w:pPr>
+              <w:spacing w:after="0" w:before="0"/>
+              <w:jc w:val="center"/>
+            </w:pPr>
+            <w:r>
+              <w:rPr>
+                <w:color w:val="FFFFFF"/>
+              </w:rPr>
+            </w:r>
+            <w:r>
+              <w:rPr>
+                <w:rFonts w:ascii="Aptos" w:hAnsi="Aptos"/>
+                <w:b/>
+                <w:color w:val="FFFFFF"/>
+                <w:sz w:val="19"/>
+              </w:rPr>
+              <w:t>Acción</w:t>
+            </w:r>
+          </w:p>
+        </w:tc>
+        <w:tc>
+          <w:tcPr>
+            <w:tcW w:type="dxa" w:w="3240"/>
+            <w:vAlign w:val="center"/>
+            <w:tcBorders>
+              <w:top w:val="single" w:sz="4" w:color="D9D9D9"/>
+              <w:left w:val="single" w:sz="4" w:color="D9D9D9"/>
+              <w:bottom w:val="single" w:sz="4" w:color="D9D9D9"/>
+              <w:right w:val="single" w:sz="4" w:color="D9D9D9"/>
+              <w:insideH w:val="single" w:sz="4" w:color="D9D9D9"/>
+              <w:insideV w:val="single" w:sz="4" w:color="D9D9D9"/>
+            </w:tcBorders>
+            <w:shd w:fill="17365D"/>
+          </w:tcPr>
+          <w:p>
+            <w:pPr>
+              <w:spacing w:after="0" w:before="0"/>
+              <w:jc w:val="center"/>
+            </w:pPr>
+            <w:r>
+              <w:rPr>
+                <w:color w:val="FFFFFF"/>
+              </w:rPr>
+            </w:r>
+            <w:r>
+              <w:rPr>
+                <w:rFonts w:ascii="Aptos" w:hAnsi="Aptos"/>
+                <w:b/>
+                <w:color w:val="FFFFFF"/>
+                <w:sz w:val="19"/>
+              </w:rPr>
+              <w:t>Resultado esperado</w:t>
+            </w:r>
+          </w:p>
+        </w:tc>
+      </w:tr>
+      <w:tr>
+        <w:trPr>
+          <w:cantSplit/>
+        </w:trPr>
+        <w:tc>
+          <w:tcPr>
+            <w:tcW w:type="dxa" w:w="1728"/>
+            <w:vAlign w:val="center"/>
+            <w:tcBorders>
+              <w:top w:val="single" w:sz="4" w:color="D9D9D9"/>
+              <w:left w:val="single" w:sz="4" w:color="D9D9D9"/>
+              <w:bottom w:val="single" w:sz="4" w:color="D9D9D9"/>
+              <w:right w:val="single" w:sz="4" w:color="D9D9D9"/>
+              <w:insideH w:val="single" w:sz="4" w:color="D9D9D9"/>
+              <w:insideV w:val="single" w:sz="4" w:color="D9D9D9"/>
+            </w:tcBorders>
+          </w:tcPr>
+          <w:p>
+            <w:pPr>
+              <w:spacing w:after="0" w:before="0"/>
+              <w:jc w:val="left"/>
+            </w:pPr>
             <w:r/>
             <w:r>
               <w:rPr>
+                <w:rFonts w:ascii="Aptos" w:hAnsi="Aptos"/>
+                <w:b w:val="0"/>
+                <w:sz w:val="19"/>
+              </w:rPr>
+              <w:t>1 Identificación</w:t>
+            </w:r>
+          </w:p>
+        </w:tc>
+        <w:tc>
+          <w:tcPr>
+            <w:tcW w:type="dxa" w:w="4464"/>
+            <w:vAlign w:val="center"/>
+            <w:tcBorders>
+              <w:top w:val="single" w:sz="4" w:color="D9D9D9"/>
+              <w:left w:val="single" w:sz="4" w:color="D9D9D9"/>
+              <w:bottom w:val="single" w:sz="4" w:color="D9D9D9"/>
+              <w:right w:val="single" w:sz="4" w:color="D9D9D9"/>
+              <w:insideH w:val="single" w:sz="4" w:color="D9D9D9"/>
+              <w:insideV w:val="single" w:sz="4" w:color="D9D9D9"/>
+            </w:tcBorders>
+          </w:tcPr>
+          <w:p>
+            <w:pPr>
+              <w:spacing w:after="0" w:before="0"/>
+              <w:jc w:val="left"/>
+            </w:pPr>
+            <w:r/>
+            <w:r>
+              <w:rPr>
+                <w:rFonts w:ascii="Aptos" w:hAnsi="Aptos"/>
+                <w:b w:val="0"/>
+                <w:sz w:val="19"/>
+              </w:rPr>
+              <w:t>Quien detecte el conflicto lo comunica al equipo; si es urgente, lo informa de inmediato.</w:t>
+            </w:r>
+          </w:p>
+        </w:tc>
+        <w:tc>
+          <w:tcPr>
+            <w:tcW w:type="dxa" w:w="3240"/>
+            <w:vAlign w:val="center"/>
+            <w:tcBorders>
+              <w:top w:val="single" w:sz="4" w:color="D9D9D9"/>
+              <w:left w:val="single" w:sz="4" w:color="D9D9D9"/>
+              <w:bottom w:val="single" w:sz="4" w:color="D9D9D9"/>
+              <w:right w:val="single" w:sz="4" w:color="D9D9D9"/>
+              <w:insideH w:val="single" w:sz="4" w:color="D9D9D9"/>
+              <w:insideV w:val="single" w:sz="4" w:color="D9D9D9"/>
+            </w:tcBorders>
+          </w:tcPr>
+          <w:p>
+            <w:pPr>
+              <w:spacing w:after="0" w:before="0"/>
+              <w:jc w:val="left"/>
+            </w:pPr>
+            <w:r/>
+            <w:r>
+              <w:rPr>
+                <w:rFonts w:ascii="Aptos" w:hAnsi="Aptos"/>
+                <w:b w:val="0"/>
+                <w:sz w:val="19"/>
+              </w:rPr>
+              <w:t>Problema descrito con contexto y partes involucradas.</w:t>
+            </w:r>
+          </w:p>
+        </w:tc>
+      </w:tr>
+      <w:tr>
+        <w:trPr>
+          <w:cantSplit/>
+        </w:trPr>
+        <w:tc>
+          <w:tcPr>
+            <w:tcW w:type="dxa" w:w="1728"/>
+            <w:vAlign w:val="center"/>
+            <w:tcBorders>
+              <w:top w:val="single" w:sz="4" w:color="D9D9D9"/>
+              <w:left w:val="single" w:sz="4" w:color="D9D9D9"/>
+              <w:bottom w:val="single" w:sz="4" w:color="D9D9D9"/>
+              <w:right w:val="single" w:sz="4" w:color="D9D9D9"/>
+              <w:insideH w:val="single" w:sz="4" w:color="D9D9D9"/>
+              <w:insideV w:val="single" w:sz="4" w:color="D9D9D9"/>
+            </w:tcBorders>
+            <w:shd w:fill="F5F9FC"/>
+          </w:tcPr>
+          <w:p>
+            <w:pPr>
+              <w:spacing w:after="0" w:before="0"/>
+              <w:jc w:val="left"/>
+            </w:pPr>
+            <w:r/>
+            <w:r>
+              <w:rPr>
+                <w:rFonts w:ascii="Aptos" w:hAnsi="Aptos"/>
+                <w:b w:val="0"/>
+                <w:sz w:val="19"/>
+              </w:rPr>
+              <w:t>2 Diálogo directo</w:t>
+            </w:r>
+          </w:p>
+        </w:tc>
+        <w:tc>
+          <w:tcPr>
+            <w:tcW w:type="dxa" w:w="4464"/>
+            <w:vAlign w:val="center"/>
+            <w:tcBorders>
+              <w:top w:val="single" w:sz="4" w:color="D9D9D9"/>
+              <w:left w:val="single" w:sz="4" w:color="D9D9D9"/>
+              <w:bottom w:val="single" w:sz="4" w:color="D9D9D9"/>
+              <w:right w:val="single" w:sz="4" w:color="D9D9D9"/>
+              <w:insideH w:val="single" w:sz="4" w:color="D9D9D9"/>
+              <w:insideV w:val="single" w:sz="4" w:color="D9D9D9"/>
+            </w:tcBorders>
+            <w:shd w:fill="F5F9FC"/>
+          </w:tcPr>
+          <w:p>
+            <w:pPr>
+              <w:spacing w:after="0" w:before="0"/>
+              <w:jc w:val="left"/>
+            </w:pPr>
+            <w:r/>
+            <w:r>
+              <w:rPr>
+                <w:rFonts w:ascii="Aptos" w:hAnsi="Aptos"/>
+                <w:b w:val="0"/>
+                <w:sz w:val="19"/>
+              </w:rPr>
+              <w:t>Las partes buscan un acuerdo en un máximo de 2 días hábiles.</w:t>
+            </w:r>
+          </w:p>
+        </w:tc>
+        <w:tc>
+          <w:tcPr>
+            <w:tcW w:type="dxa" w:w="3240"/>
+            <w:vAlign w:val="center"/>
+            <w:tcBorders>
+              <w:top w:val="single" w:sz="4" w:color="D9D9D9"/>
+              <w:left w:val="single" w:sz="4" w:color="D9D9D9"/>
+              <w:bottom w:val="single" w:sz="4" w:color="D9D9D9"/>
+              <w:right w:val="single" w:sz="4" w:color="D9D9D9"/>
+              <w:insideH w:val="single" w:sz="4" w:color="D9D9D9"/>
+              <w:insideV w:val="single" w:sz="4" w:color="D9D9D9"/>
+            </w:tcBorders>
+            <w:shd w:fill="F5F9FC"/>
+          </w:tcPr>
+          <w:p>
+            <w:pPr>
+              <w:spacing w:after="0" w:before="0"/>
+              <w:jc w:val="left"/>
+            </w:pPr>
+            <w:r/>
+            <w:r>
+              <w:rPr>
+                <w:rFonts w:ascii="Aptos" w:hAnsi="Aptos"/>
+                <w:b w:val="0"/>
+                <w:sz w:val="19"/>
+              </w:rPr>
+              <w:t>Acuerdo documentado o escalamiento.</w:t>
+            </w:r>
+          </w:p>
+        </w:tc>
+      </w:tr>
+      <w:tr>
+        <w:trPr>
+          <w:cantSplit/>
+        </w:trPr>
+        <w:tc>
+          <w:tcPr>
+            <w:tcW w:type="dxa" w:w="1728"/>
+            <w:vAlign w:val="center"/>
+            <w:tcBorders>
+              <w:top w:val="single" w:sz="4" w:color="D9D9D9"/>
+              <w:left w:val="single" w:sz="4" w:color="D9D9D9"/>
+              <w:bottom w:val="single" w:sz="4" w:color="D9D9D9"/>
+              <w:right w:val="single" w:sz="4" w:color="D9D9D9"/>
+              <w:insideH w:val="single" w:sz="4" w:color="D9D9D9"/>
+              <w:insideV w:val="single" w:sz="4" w:color="D9D9D9"/>
+            </w:tcBorders>
+          </w:tcPr>
+          <w:p>
+            <w:pPr>
+              <w:spacing w:after="0" w:before="0"/>
+              <w:jc w:val="left"/>
+            </w:pPr>
+            <w:r/>
+            <w:r>
+              <w:rPr>
+                <w:rFonts w:ascii="Aptos" w:hAnsi="Aptos"/>
+                <w:b w:val="0"/>
+                <w:sz w:val="19"/>
+              </w:rPr>
+              <w:t>3 Reunión de equipo</w:t>
+            </w:r>
+          </w:p>
+        </w:tc>
+        <w:tc>
+          <w:tcPr>
+            <w:tcW w:type="dxa" w:w="4464"/>
+            <w:vAlign w:val="center"/>
+            <w:tcBorders>
+              <w:top w:val="single" w:sz="4" w:color="D9D9D9"/>
+              <w:left w:val="single" w:sz="4" w:color="D9D9D9"/>
+              <w:bottom w:val="single" w:sz="4" w:color="D9D9D9"/>
+              <w:right w:val="single" w:sz="4" w:color="D9D9D9"/>
+              <w:insideH w:val="single" w:sz="4" w:color="D9D9D9"/>
+              <w:insideV w:val="single" w:sz="4" w:color="D9D9D9"/>
+            </w:tcBorders>
+          </w:tcPr>
+          <w:p>
+            <w:pPr>
+              <w:spacing w:after="0" w:before="0"/>
+              <w:jc w:val="left"/>
+            </w:pPr>
+            <w:r/>
+            <w:r>
+              <w:rPr>
+                <w:rFonts w:ascii="Aptos" w:hAnsi="Aptos"/>
+                <w:b w:val="0"/>
+                <w:sz w:val="19"/>
+              </w:rPr>
+              <w:t>Se revisan alternativas, impacto y decisión. El acuerdo se registra en un acta.</w:t>
+            </w:r>
+          </w:p>
+        </w:tc>
+        <w:tc>
+          <w:tcPr>
+            <w:tcW w:type="dxa" w:w="3240"/>
+            <w:vAlign w:val="center"/>
+            <w:tcBorders>
+              <w:top w:val="single" w:sz="4" w:color="D9D9D9"/>
+              <w:left w:val="single" w:sz="4" w:color="D9D9D9"/>
+              <w:bottom w:val="single" w:sz="4" w:color="D9D9D9"/>
+              <w:right w:val="single" w:sz="4" w:color="D9D9D9"/>
+              <w:insideH w:val="single" w:sz="4" w:color="D9D9D9"/>
+              <w:insideV w:val="single" w:sz="4" w:color="D9D9D9"/>
+            </w:tcBorders>
+          </w:tcPr>
+          <w:p>
+            <w:pPr>
+              <w:spacing w:after="0" w:before="0"/>
+              <w:jc w:val="left"/>
+            </w:pPr>
+            <w:r/>
+            <w:r>
+              <w:rPr>
+                <w:rFonts w:ascii="Aptos" w:hAnsi="Aptos"/>
+                <w:b w:val="0"/>
+                <w:sz w:val="19"/>
+              </w:rPr>
+              <w:t>Decisión compartida y responsables definidos.</w:t>
+            </w:r>
+          </w:p>
+        </w:tc>
+      </w:tr>
+      <w:tr>
+        <w:trPr>
+          <w:cantSplit/>
+        </w:trPr>
+        <w:tc>
+          <w:tcPr>
+            <w:tcW w:type="dxa" w:w="1728"/>
+            <w:vAlign w:val="center"/>
+            <w:tcBorders>
+              <w:top w:val="single" w:sz="4" w:color="D9D9D9"/>
+              <w:left w:val="single" w:sz="4" w:color="D9D9D9"/>
+              <w:bottom w:val="single" w:sz="4" w:color="D9D9D9"/>
+              <w:right w:val="single" w:sz="4" w:color="D9D9D9"/>
+              <w:insideH w:val="single" w:sz="4" w:color="D9D9D9"/>
+              <w:insideV w:val="single" w:sz="4" w:color="D9D9D9"/>
+            </w:tcBorders>
+            <w:shd w:fill="F5F9FC"/>
+          </w:tcPr>
+          <w:p>
+            <w:pPr>
+              <w:spacing w:after="0" w:before="0"/>
+              <w:jc w:val="left"/>
+            </w:pPr>
+            <w:r/>
+            <w:r>
+              <w:rPr>
+                <w:rFonts w:ascii="Aptos" w:hAnsi="Aptos"/>
+                <w:b w:val="0"/>
+                <w:sz w:val="19"/>
+              </w:rPr>
+              <w:t>4 Mediación docente</w:t>
+            </w:r>
+          </w:p>
+        </w:tc>
+        <w:tc>
+          <w:tcPr>
+            <w:tcW w:type="dxa" w:w="4464"/>
+            <w:vAlign w:val="center"/>
+            <w:tcBorders>
+              <w:top w:val="single" w:sz="4" w:color="D9D9D9"/>
+              <w:left w:val="single" w:sz="4" w:color="D9D9D9"/>
+              <w:bottom w:val="single" w:sz="4" w:color="D9D9D9"/>
+              <w:right w:val="single" w:sz="4" w:color="D9D9D9"/>
+              <w:insideH w:val="single" w:sz="4" w:color="D9D9D9"/>
+              <w:insideV w:val="single" w:sz="4" w:color="D9D9D9"/>
+            </w:tcBorders>
+            <w:shd w:fill="F5F9FC"/>
+          </w:tcPr>
+          <w:p>
+            <w:pPr>
+              <w:spacing w:after="0" w:before="0"/>
+              <w:jc w:val="left"/>
+            </w:pPr>
+            <w:r/>
+            <w:r>
+              <w:rPr>
+                <w:rFonts w:ascii="Aptos" w:hAnsi="Aptos"/>
+                <w:b w:val="0"/>
+                <w:sz w:val="19"/>
+              </w:rPr>
+              <w:t>Si afecta el cumplimiento y no hay acuerdo, se solicita mediación de Luis Bravo.</w:t>
+            </w:r>
+          </w:p>
+        </w:tc>
+        <w:tc>
+          <w:tcPr>
+            <w:tcW w:type="dxa" w:w="3240"/>
+            <w:vAlign w:val="center"/>
+            <w:tcBorders>
+              <w:top w:val="single" w:sz="4" w:color="D9D9D9"/>
+              <w:left w:val="single" w:sz="4" w:color="D9D9D9"/>
+              <w:bottom w:val="single" w:sz="4" w:color="D9D9D9"/>
+              <w:right w:val="single" w:sz="4" w:color="D9D9D9"/>
+              <w:insideH w:val="single" w:sz="4" w:color="D9D9D9"/>
+              <w:insideV w:val="single" w:sz="4" w:color="D9D9D9"/>
+            </w:tcBorders>
+            <w:shd w:fill="F5F9FC"/>
+          </w:tcPr>
+          <w:p>
+            <w:pPr>
+              <w:spacing w:after="0" w:before="0"/>
+              <w:jc w:val="left"/>
+            </w:pPr>
+            <w:r/>
+            <w:r>
+              <w:rPr>
+                <w:rFonts w:ascii="Aptos" w:hAnsi="Aptos"/>
+                <w:b w:val="0"/>
+                <w:sz w:val="19"/>
+              </w:rPr>
+              <w:t>Orientación o decisión registrada.</w:t>
+            </w:r>
+          </w:p>
+        </w:tc>
+      </w:tr>
+      <w:tr>
+        <w:trPr>
+          <w:cantSplit/>
+        </w:trPr>
+        <w:tc>
+          <w:tcPr>
+            <w:tcW w:type="dxa" w:w="1728"/>
+            <w:vAlign w:val="center"/>
+            <w:tcBorders>
+              <w:top w:val="single" w:sz="4" w:color="D9D9D9"/>
+              <w:left w:val="single" w:sz="4" w:color="D9D9D9"/>
+              <w:bottom w:val="single" w:sz="4" w:color="D9D9D9"/>
+              <w:right w:val="single" w:sz="4" w:color="D9D9D9"/>
+              <w:insideH w:val="single" w:sz="4" w:color="D9D9D9"/>
+              <w:insideV w:val="single" w:sz="4" w:color="D9D9D9"/>
+            </w:tcBorders>
+          </w:tcPr>
+          <w:p>
+            <w:pPr>
+              <w:spacing w:after="0" w:before="0"/>
+              <w:jc w:val="center"/>
+            </w:pPr>
+            <w:r/>
+            <w:r>
+              <w:rPr>
+                <w:rFonts w:ascii="Aptos" w:hAnsi="Aptos"/>
+                <w:b w:val="0"/>
+                <w:sz w:val="19"/>
+              </w:rPr>
+              <w:t>5 Registro</w:t>
+            </w:r>
+          </w:p>
+        </w:tc>
+        <w:tc>
+          <w:tcPr>
+            <w:tcW w:type="dxa" w:w="4464"/>
+            <w:vAlign w:val="center"/>
+            <w:tcBorders>
+              <w:top w:val="single" w:sz="4" w:color="D9D9D9"/>
+              <w:left w:val="single" w:sz="4" w:color="D9D9D9"/>
+              <w:bottom w:val="single" w:sz="4" w:color="D9D9D9"/>
+              <w:right w:val="single" w:sz="4" w:color="D9D9D9"/>
+              <w:insideH w:val="single" w:sz="4" w:color="D9D9D9"/>
+              <w:insideV w:val="single" w:sz="4" w:color="D9D9D9"/>
+            </w:tcBorders>
+          </w:tcPr>
+          <w:p>
+            <w:pPr>
+              <w:spacing w:after="0" w:before="0"/>
+              <w:jc w:val="left"/>
+            </w:pPr>
+            <w:r/>
+            <w:r>
+              <w:rPr>
+                <w:rFonts w:ascii="Aptos" w:hAnsi="Aptos"/>
+                <w:b w:val="0"/>
+                <w:sz w:val="19"/>
+              </w:rPr>
+              <w:t>Se completa el registro de conflictos, incluso si se resolvió en diálogo directo.</w:t>
+            </w:r>
+          </w:p>
+        </w:tc>
+        <w:tc>
+          <w:tcPr>
+            <w:tcW w:type="dxa" w:w="3240"/>
+            <w:vAlign w:val="center"/>
+            <w:tcBorders>
+              <w:top w:val="single" w:sz="4" w:color="D9D9D9"/>
+              <w:left w:val="single" w:sz="4" w:color="D9D9D9"/>
+              <w:bottom w:val="single" w:sz="4" w:color="D9D9D9"/>
+              <w:right w:val="single" w:sz="4" w:color="D9D9D9"/>
+              <w:insideH w:val="single" w:sz="4" w:color="D9D9D9"/>
+              <w:insideV w:val="single" w:sz="4" w:color="D9D9D9"/>
+            </w:tcBorders>
+          </w:tcPr>
+          <w:p>
+            <w:pPr>
+              <w:spacing w:after="0" w:before="0"/>
+              <w:jc w:val="left"/>
+            </w:pPr>
+            <w:r/>
+            <w:r>
+              <w:rPr>
+                <w:rFonts w:ascii="Aptos" w:hAnsi="Aptos"/>
+                <w:b w:val="0"/>
+                <w:sz w:val="19"/>
+              </w:rPr>
+              <w:t>Trazabilidad de la situación y su cierre.</w:t>
+            </w:r>
+          </w:p>
+        </w:tc>
+      </w:tr>
+    </w:tbl>
+    <w:p>
+      <w:pPr>
+        <w:spacing w:after="40"/>
+      </w:pPr>
+    </w:p>
+    <w:p>
+      <w:pPr>
+        <w:pStyle w:val="Heading1"/>
+      </w:pPr>
+      <w:r>
+        <w:t>Matriz de escalamiento</w:t>
+      </w:r>
+    </w:p>
+    <w:tbl>
+      <w:tblPr>
+        <w:tblStyle w:val="TableGrid"/>
+        <w:tblW w:type="auto" w:w="0"/>
+        <w:jc w:val="center"/>
+        <w:tblLook w:firstColumn="1" w:firstRow="1" w:lastColumn="0" w:lastRow="0" w:noHBand="0" w:noVBand="1" w:val="04A0"/>
+      </w:tblPr>
+      <w:tblGrid>
+        <w:gridCol w:w="2556"/>
+        <w:gridCol w:w="2556"/>
+        <w:gridCol w:w="2556"/>
+        <w:gridCol w:w="2556"/>
+      </w:tblGrid>
+      <w:tr>
+        <w:trPr>
+          <w:cantSplit/>
+          <w:tblHeader w:val="true"/>
+        </w:trPr>
+        <w:tc>
+          <w:tcPr>
+            <w:tcW w:type="dxa" w:w="792"/>
+            <w:vAlign w:val="center"/>
+            <w:tcBorders>
+              <w:top w:val="single" w:sz="4" w:color="D9D9D9"/>
+              <w:left w:val="single" w:sz="4" w:color="D9D9D9"/>
+              <w:bottom w:val="single" w:sz="4" w:color="D9D9D9"/>
+              <w:right w:val="single" w:sz="4" w:color="D9D9D9"/>
+              <w:insideH w:val="single" w:sz="4" w:color="D9D9D9"/>
+              <w:insideV w:val="single" w:sz="4" w:color="D9D9D9"/>
+            </w:tcBorders>
+            <w:shd w:fill="17365D"/>
+          </w:tcPr>
+          <w:p>
+            <w:pPr>
+              <w:spacing w:after="0" w:before="0"/>
+              <w:jc w:val="center"/>
+            </w:pPr>
+            <w:r>
+              <w:rPr>
+                <w:color w:val="FFFFFF"/>
+              </w:rPr>
+            </w:r>
+            <w:r>
+              <w:rPr>
+                <w:rFonts w:ascii="Aptos" w:hAnsi="Aptos"/>
                 <w:b/>
                 <w:color w:val="FFFFFF"/>
-                <w:sz w:val="20"/>
+                <w:sz w:val="19"/>
+              </w:rPr>
+              <w:t>Nivel</w:t>
+            </w:r>
+          </w:p>
+        </w:tc>
+        <w:tc>
+          <w:tcPr>
+            <w:tcW w:type="dxa" w:w="3456"/>
+            <w:vAlign w:val="center"/>
+            <w:tcBorders>
+              <w:top w:val="single" w:sz="4" w:color="D9D9D9"/>
+              <w:left w:val="single" w:sz="4" w:color="D9D9D9"/>
+              <w:bottom w:val="single" w:sz="4" w:color="D9D9D9"/>
+              <w:right w:val="single" w:sz="4" w:color="D9D9D9"/>
+              <w:insideH w:val="single" w:sz="4" w:color="D9D9D9"/>
+              <w:insideV w:val="single" w:sz="4" w:color="D9D9D9"/>
+            </w:tcBorders>
+            <w:shd w:fill="17365D"/>
+          </w:tcPr>
+          <w:p>
+            <w:pPr>
+              <w:spacing w:after="0" w:before="0"/>
+              <w:jc w:val="center"/>
+            </w:pPr>
+            <w:r>
+              <w:rPr>
+                <w:color w:val="FFFFFF"/>
+              </w:rPr>
+            </w:r>
+            <w:r>
+              <w:rPr>
+                <w:rFonts w:ascii="Aptos" w:hAnsi="Aptos"/>
+                <w:b/>
+                <w:color w:val="FFFFFF"/>
+                <w:sz w:val="19"/>
+              </w:rPr>
+              <w:t>Instancia</w:t>
+            </w:r>
+          </w:p>
+        </w:tc>
+        <w:tc>
+          <w:tcPr>
+            <w:tcW w:type="dxa" w:w="2448"/>
+            <w:vAlign w:val="center"/>
+            <w:tcBorders>
+              <w:top w:val="single" w:sz="4" w:color="D9D9D9"/>
+              <w:left w:val="single" w:sz="4" w:color="D9D9D9"/>
+              <w:bottom w:val="single" w:sz="4" w:color="D9D9D9"/>
+              <w:right w:val="single" w:sz="4" w:color="D9D9D9"/>
+              <w:insideH w:val="single" w:sz="4" w:color="D9D9D9"/>
+              <w:insideV w:val="single" w:sz="4" w:color="D9D9D9"/>
+            </w:tcBorders>
+            <w:shd w:fill="17365D"/>
+          </w:tcPr>
+          <w:p>
+            <w:pPr>
+              <w:spacing w:after="0" w:before="0"/>
+              <w:jc w:val="center"/>
+            </w:pPr>
+            <w:r>
+              <w:rPr>
+                <w:color w:val="FFFFFF"/>
+              </w:rPr>
+            </w:r>
+            <w:r>
+              <w:rPr>
+                <w:rFonts w:ascii="Aptos" w:hAnsi="Aptos"/>
+                <w:b/>
+                <w:color w:val="FFFFFF"/>
+                <w:sz w:val="19"/>
+              </w:rPr>
+              <w:t>Responsable</w:t>
+            </w:r>
+          </w:p>
+        </w:tc>
+        <w:tc>
+          <w:tcPr>
+            <w:tcW w:type="dxa" w:w="2736"/>
+            <w:vAlign w:val="center"/>
+            <w:tcBorders>
+              <w:top w:val="single" w:sz="4" w:color="D9D9D9"/>
+              <w:left w:val="single" w:sz="4" w:color="D9D9D9"/>
+              <w:bottom w:val="single" w:sz="4" w:color="D9D9D9"/>
+              <w:right w:val="single" w:sz="4" w:color="D9D9D9"/>
+              <w:insideH w:val="single" w:sz="4" w:color="D9D9D9"/>
+              <w:insideV w:val="single" w:sz="4" w:color="D9D9D9"/>
+            </w:tcBorders>
+            <w:shd w:fill="17365D"/>
+          </w:tcPr>
+          <w:p>
+            <w:pPr>
+              <w:spacing w:after="0" w:before="0"/>
+              <w:jc w:val="center"/>
+            </w:pPr>
+            <w:r>
+              <w:rPr>
+                <w:color w:val="FFFFFF"/>
+              </w:rPr>
+            </w:r>
+            <w:r>
+              <w:rPr>
+                <w:rFonts w:ascii="Aptos" w:hAnsi="Aptos"/>
+                <w:b/>
+                <w:color w:val="FFFFFF"/>
+                <w:sz w:val="19"/>
+              </w:rPr>
+              <w:t>Plazo sugerido</w:t>
+            </w:r>
+          </w:p>
+        </w:tc>
+      </w:tr>
+      <w:tr>
+        <w:trPr>
+          <w:cantSplit/>
+        </w:trPr>
+        <w:tc>
+          <w:tcPr>
+            <w:tcW w:type="dxa" w:w="792"/>
+            <w:vAlign w:val="center"/>
+            <w:tcBorders>
+              <w:top w:val="single" w:sz="4" w:color="D9D9D9"/>
+              <w:left w:val="single" w:sz="4" w:color="D9D9D9"/>
+              <w:bottom w:val="single" w:sz="4" w:color="D9D9D9"/>
+              <w:right w:val="single" w:sz="4" w:color="D9D9D9"/>
+              <w:insideH w:val="single" w:sz="4" w:color="D9D9D9"/>
+              <w:insideV w:val="single" w:sz="4" w:color="D9D9D9"/>
+            </w:tcBorders>
+          </w:tcPr>
+          <w:p>
+            <w:pPr>
+              <w:spacing w:after="0" w:before="0"/>
+              <w:jc w:val="center"/>
+            </w:pPr>
+            <w:r/>
+            <w:r>
+              <w:rPr>
+                <w:rFonts w:ascii="Aptos" w:hAnsi="Aptos"/>
+                <w:b w:val="0"/>
+                <w:sz w:val="19"/>
+              </w:rPr>
+              <w:t>1</w:t>
+            </w:r>
+          </w:p>
+        </w:tc>
+        <w:tc>
+          <w:tcPr>
+            <w:tcW w:type="dxa" w:w="3456"/>
+            <w:vAlign w:val="center"/>
+            <w:tcBorders>
+              <w:top w:val="single" w:sz="4" w:color="D9D9D9"/>
+              <w:left w:val="single" w:sz="4" w:color="D9D9D9"/>
+              <w:bottom w:val="single" w:sz="4" w:color="D9D9D9"/>
+              <w:right w:val="single" w:sz="4" w:color="D9D9D9"/>
+              <w:insideH w:val="single" w:sz="4" w:color="D9D9D9"/>
+              <w:insideV w:val="single" w:sz="4" w:color="D9D9D9"/>
+            </w:tcBorders>
+          </w:tcPr>
+          <w:p>
+            <w:pPr>
+              <w:spacing w:after="0" w:before="0"/>
+              <w:jc w:val="left"/>
+            </w:pPr>
+            <w:r/>
+            <w:r>
+              <w:rPr>
+                <w:rFonts w:ascii="Aptos" w:hAnsi="Aptos"/>
+                <w:b w:val="0"/>
+                <w:sz w:val="19"/>
+              </w:rPr>
+              <w:t>Diálogo directo entre las partes</w:t>
+            </w:r>
+          </w:p>
+        </w:tc>
+        <w:tc>
+          <w:tcPr>
+            <w:tcW w:type="dxa" w:w="2448"/>
+            <w:vAlign w:val="center"/>
+            <w:tcBorders>
+              <w:top w:val="single" w:sz="4" w:color="D9D9D9"/>
+              <w:left w:val="single" w:sz="4" w:color="D9D9D9"/>
+              <w:bottom w:val="single" w:sz="4" w:color="D9D9D9"/>
+              <w:right w:val="single" w:sz="4" w:color="D9D9D9"/>
+              <w:insideH w:val="single" w:sz="4" w:color="D9D9D9"/>
+              <w:insideV w:val="single" w:sz="4" w:color="D9D9D9"/>
+            </w:tcBorders>
+          </w:tcPr>
+          <w:p>
+            <w:pPr>
+              <w:spacing w:after="0" w:before="0"/>
+              <w:jc w:val="left"/>
+            </w:pPr>
+            <w:r/>
+            <w:r>
+              <w:rPr>
+                <w:rFonts w:ascii="Aptos" w:hAnsi="Aptos"/>
+                <w:b w:val="0"/>
+                <w:sz w:val="19"/>
+              </w:rPr>
+              <w:t>Integrantes involucrados</w:t>
+            </w:r>
+          </w:p>
+        </w:tc>
+        <w:tc>
+          <w:tcPr>
+            <w:tcW w:type="dxa" w:w="2736"/>
+            <w:vAlign w:val="center"/>
+            <w:tcBorders>
+              <w:top w:val="single" w:sz="4" w:color="D9D9D9"/>
+              <w:left w:val="single" w:sz="4" w:color="D9D9D9"/>
+              <w:bottom w:val="single" w:sz="4" w:color="D9D9D9"/>
+              <w:right w:val="single" w:sz="4" w:color="D9D9D9"/>
+              <w:insideH w:val="single" w:sz="4" w:color="D9D9D9"/>
+              <w:insideV w:val="single" w:sz="4" w:color="D9D9D9"/>
+            </w:tcBorders>
+          </w:tcPr>
+          <w:p>
+            <w:pPr>
+              <w:spacing w:after="0" w:before="0"/>
+              <w:jc w:val="left"/>
+            </w:pPr>
+            <w:r/>
+            <w:r>
+              <w:rPr>
+                <w:rFonts w:ascii="Aptos" w:hAnsi="Aptos"/>
+                <w:b w:val="0"/>
+                <w:sz w:val="19"/>
+              </w:rPr>
+              <w:t>2 días hábiles</w:t>
+            </w:r>
+          </w:p>
+        </w:tc>
+      </w:tr>
+      <w:tr>
+        <w:trPr>
+          <w:cantSplit/>
+        </w:trPr>
+        <w:tc>
+          <w:tcPr>
+            <w:tcW w:type="dxa" w:w="792"/>
+            <w:vAlign w:val="center"/>
+            <w:tcBorders>
+              <w:top w:val="single" w:sz="4" w:color="D9D9D9"/>
+              <w:left w:val="single" w:sz="4" w:color="D9D9D9"/>
+              <w:bottom w:val="single" w:sz="4" w:color="D9D9D9"/>
+              <w:right w:val="single" w:sz="4" w:color="D9D9D9"/>
+              <w:insideH w:val="single" w:sz="4" w:color="D9D9D9"/>
+              <w:insideV w:val="single" w:sz="4" w:color="D9D9D9"/>
+            </w:tcBorders>
+            <w:shd w:fill="F5F9FC"/>
+          </w:tcPr>
+          <w:p>
+            <w:pPr>
+              <w:spacing w:after="0" w:before="0"/>
+              <w:jc w:val="center"/>
+            </w:pPr>
+            <w:r/>
+            <w:r>
+              <w:rPr>
+                <w:rFonts w:ascii="Aptos" w:hAnsi="Aptos"/>
+                <w:b w:val="0"/>
+                <w:sz w:val="19"/>
+              </w:rPr>
+              <w:t>2</w:t>
+            </w:r>
+          </w:p>
+        </w:tc>
+        <w:tc>
+          <w:tcPr>
+            <w:tcW w:type="dxa" w:w="3456"/>
+            <w:vAlign w:val="center"/>
+            <w:tcBorders>
+              <w:top w:val="single" w:sz="4" w:color="D9D9D9"/>
+              <w:left w:val="single" w:sz="4" w:color="D9D9D9"/>
+              <w:bottom w:val="single" w:sz="4" w:color="D9D9D9"/>
+              <w:right w:val="single" w:sz="4" w:color="D9D9D9"/>
+              <w:insideH w:val="single" w:sz="4" w:color="D9D9D9"/>
+              <w:insideV w:val="single" w:sz="4" w:color="D9D9D9"/>
+            </w:tcBorders>
+            <w:shd w:fill="F5F9FC"/>
+          </w:tcPr>
+          <w:p>
+            <w:pPr>
+              <w:spacing w:after="0" w:before="0"/>
+              <w:jc w:val="left"/>
+            </w:pPr>
+            <w:r/>
+            <w:r>
+              <w:rPr>
+                <w:rFonts w:ascii="Aptos" w:hAnsi="Aptos"/>
+                <w:b w:val="0"/>
+                <w:sz w:val="19"/>
+              </w:rPr>
+              <w:t>Reunión de equipo completo</w:t>
+            </w:r>
+          </w:p>
+        </w:tc>
+        <w:tc>
+          <w:tcPr>
+            <w:tcW w:type="dxa" w:w="2448"/>
+            <w:vAlign w:val="center"/>
+            <w:tcBorders>
+              <w:top w:val="single" w:sz="4" w:color="D9D9D9"/>
+              <w:left w:val="single" w:sz="4" w:color="D9D9D9"/>
+              <w:bottom w:val="single" w:sz="4" w:color="D9D9D9"/>
+              <w:right w:val="single" w:sz="4" w:color="D9D9D9"/>
+              <w:insideH w:val="single" w:sz="4" w:color="D9D9D9"/>
+              <w:insideV w:val="single" w:sz="4" w:color="D9D9D9"/>
+            </w:tcBorders>
+            <w:shd w:fill="F5F9FC"/>
+          </w:tcPr>
+          <w:p>
+            <w:pPr>
+              <w:spacing w:after="0" w:before="0"/>
+              <w:jc w:val="left"/>
+            </w:pPr>
+            <w:r/>
+            <w:r>
+              <w:rPr>
+                <w:rFonts w:ascii="Aptos" w:hAnsi="Aptos"/>
+                <w:b w:val="0"/>
+                <w:sz w:val="19"/>
+              </w:rPr>
+              <w:t>Todo el equipo</w:t>
+            </w:r>
+          </w:p>
+        </w:tc>
+        <w:tc>
+          <w:tcPr>
+            <w:tcW w:type="dxa" w:w="2736"/>
+            <w:vAlign w:val="center"/>
+            <w:tcBorders>
+              <w:top w:val="single" w:sz="4" w:color="D9D9D9"/>
+              <w:left w:val="single" w:sz="4" w:color="D9D9D9"/>
+              <w:bottom w:val="single" w:sz="4" w:color="D9D9D9"/>
+              <w:right w:val="single" w:sz="4" w:color="D9D9D9"/>
+              <w:insideH w:val="single" w:sz="4" w:color="D9D9D9"/>
+              <w:insideV w:val="single" w:sz="4" w:color="D9D9D9"/>
+            </w:tcBorders>
+            <w:shd w:fill="F5F9FC"/>
+          </w:tcPr>
+          <w:p>
+            <w:pPr>
+              <w:spacing w:after="0" w:before="0"/>
+              <w:jc w:val="left"/>
+            </w:pPr>
+            <w:r/>
+            <w:r>
+              <w:rPr>
+                <w:rFonts w:ascii="Aptos" w:hAnsi="Aptos"/>
+                <w:b w:val="0"/>
+                <w:sz w:val="19"/>
+              </w:rPr>
+              <w:t>1 semana</w:t>
+            </w:r>
+          </w:p>
+        </w:tc>
+      </w:tr>
+      <w:tr>
+        <w:trPr>
+          <w:cantSplit/>
+        </w:trPr>
+        <w:tc>
+          <w:tcPr>
+            <w:tcW w:type="dxa" w:w="792"/>
+            <w:vAlign w:val="center"/>
+            <w:tcBorders>
+              <w:top w:val="single" w:sz="4" w:color="D9D9D9"/>
+              <w:left w:val="single" w:sz="4" w:color="D9D9D9"/>
+              <w:bottom w:val="single" w:sz="4" w:color="D9D9D9"/>
+              <w:right w:val="single" w:sz="4" w:color="D9D9D9"/>
+              <w:insideH w:val="single" w:sz="4" w:color="D9D9D9"/>
+              <w:insideV w:val="single" w:sz="4" w:color="D9D9D9"/>
+            </w:tcBorders>
+          </w:tcPr>
+          <w:p>
+            <w:pPr>
+              <w:spacing w:after="0" w:before="0"/>
+              <w:jc w:val="center"/>
+            </w:pPr>
+            <w:r/>
+            <w:r>
+              <w:rPr>
+                <w:rFonts w:ascii="Aptos" w:hAnsi="Aptos"/>
+                <w:b w:val="0"/>
+                <w:sz w:val="19"/>
+              </w:rPr>
+              <w:t>3</w:t>
+            </w:r>
+          </w:p>
+        </w:tc>
+        <w:tc>
+          <w:tcPr>
+            <w:tcW w:type="dxa" w:w="3456"/>
+            <w:vAlign w:val="center"/>
+            <w:tcBorders>
+              <w:top w:val="single" w:sz="4" w:color="D9D9D9"/>
+              <w:left w:val="single" w:sz="4" w:color="D9D9D9"/>
+              <w:bottom w:val="single" w:sz="4" w:color="D9D9D9"/>
+              <w:right w:val="single" w:sz="4" w:color="D9D9D9"/>
+              <w:insideH w:val="single" w:sz="4" w:color="D9D9D9"/>
+              <w:insideV w:val="single" w:sz="4" w:color="D9D9D9"/>
+            </w:tcBorders>
+          </w:tcPr>
+          <w:p>
+            <w:pPr>
+              <w:spacing w:after="0" w:before="0"/>
+              <w:jc w:val="left"/>
+            </w:pPr>
+            <w:r/>
+            <w:r>
+              <w:rPr>
+                <w:rFonts w:ascii="Aptos" w:hAnsi="Aptos"/>
+                <w:b w:val="0"/>
+                <w:sz w:val="19"/>
+              </w:rPr>
+              <w:t>Mediación del docente guía</w:t>
+            </w:r>
+          </w:p>
+        </w:tc>
+        <w:tc>
+          <w:tcPr>
+            <w:tcW w:type="dxa" w:w="2448"/>
+            <w:vAlign w:val="center"/>
+            <w:tcBorders>
+              <w:top w:val="single" w:sz="4" w:color="D9D9D9"/>
+              <w:left w:val="single" w:sz="4" w:color="D9D9D9"/>
+              <w:bottom w:val="single" w:sz="4" w:color="D9D9D9"/>
+              <w:right w:val="single" w:sz="4" w:color="D9D9D9"/>
+              <w:insideH w:val="single" w:sz="4" w:color="D9D9D9"/>
+              <w:insideV w:val="single" w:sz="4" w:color="D9D9D9"/>
+            </w:tcBorders>
+          </w:tcPr>
+          <w:p>
+            <w:pPr>
+              <w:spacing w:after="0" w:before="0"/>
+              <w:jc w:val="left"/>
+            </w:pPr>
+            <w:r/>
+            <w:r>
+              <w:rPr>
+                <w:rFonts w:ascii="Aptos" w:hAnsi="Aptos"/>
+                <w:b w:val="0"/>
+                <w:sz w:val="19"/>
+              </w:rPr>
+              <w:t>Luis Bravo</w:t>
+            </w:r>
+          </w:p>
+        </w:tc>
+        <w:tc>
+          <w:tcPr>
+            <w:tcW w:type="dxa" w:w="2736"/>
+            <w:vAlign w:val="center"/>
+            <w:tcBorders>
+              <w:top w:val="single" w:sz="4" w:color="D9D9D9"/>
+              <w:left w:val="single" w:sz="4" w:color="D9D9D9"/>
+              <w:bottom w:val="single" w:sz="4" w:color="D9D9D9"/>
+              <w:right w:val="single" w:sz="4" w:color="D9D9D9"/>
+              <w:insideH w:val="single" w:sz="4" w:color="D9D9D9"/>
+              <w:insideV w:val="single" w:sz="4" w:color="D9D9D9"/>
+            </w:tcBorders>
+          </w:tcPr>
+          <w:p>
+            <w:pPr>
+              <w:spacing w:after="0" w:before="0"/>
+              <w:jc w:val="left"/>
+            </w:pPr>
+            <w:r/>
+            <w:r>
+              <w:rPr>
+                <w:rFonts w:ascii="Aptos" w:hAnsi="Aptos"/>
+                <w:b w:val="0"/>
+                <w:sz w:val="19"/>
+              </w:rPr>
+              <w:t>Según disponibilidad del docente</w:t>
+            </w:r>
+          </w:p>
+        </w:tc>
+      </w:tr>
+    </w:tbl>
+    <w:p>
+      <w:pPr>
+        <w:spacing w:after="40"/>
+      </w:pPr>
+    </w:p>
+    <w:p>
+      <w:pPr>
+        <w:pStyle w:val="Heading1"/>
+      </w:pPr>
+      <w:r>
+        <w:t>Criterio de registro y seguimiento</w:t>
+      </w:r>
+    </w:p>
+    <w:p>
+      <w:r>
+        <w:t>Un conflicto se registra cuando existe una diferencia que no puede resolverse de inmediato y afecta una decisión, una responsabilidad, el alcance o una fecha comprometida. Cada caso debe indicar el acuerdo adoptado, responsable, fecha de revisión y vínculo al acta o estado de avance correspondiente. Los riesgos y pendientes se siguen en el informe de estados de avance hasta que requieran escalamiento.</w:t>
+      </w:r>
+    </w:p>
+    <w:p>
+      <w:pPr>
+        <w:pStyle w:val="Heading1"/>
+      </w:pPr>
+      <w:r>
+        <w:t>Registro de conflictos</w:t>
+      </w:r>
+    </w:p>
+    <w:p>
+      <w:r>
+        <w:t>No se han registrado conflictos a la fecha de actualización. Esta condición coincide con el Acta N.º 01 y el registro se activará únicamente si ocurre una situación real y el equipo inicia su tratamiento.</w:t>
+      </w:r>
+    </w:p>
+    <w:tbl>
+      <w:tblPr>
+        <w:tblStyle w:val="TableGrid"/>
+        <w:tblW w:type="auto" w:w="0"/>
+        <w:jc w:val="center"/>
+        <w:tblLook w:firstColumn="1" w:firstRow="1" w:lastColumn="0" w:lastRow="0" w:noHBand="0" w:noVBand="1" w:val="04A0"/>
+      </w:tblPr>
+      <w:tblGrid>
+        <w:gridCol w:w="1278"/>
+        <w:gridCol w:w="1278"/>
+        <w:gridCol w:w="1278"/>
+        <w:gridCol w:w="1278"/>
+        <w:gridCol w:w="1278"/>
+        <w:gridCol w:w="1278"/>
+        <w:gridCol w:w="1278"/>
+        <w:gridCol w:w="1278"/>
+      </w:tblGrid>
+      <w:tr>
+        <w:trPr>
+          <w:cantSplit/>
+          <w:tblHeader w:val="true"/>
+        </w:trPr>
+        <w:tc>
+          <w:tcPr>
+            <w:tcW w:type="dxa" w:w="504"/>
+            <w:vAlign w:val="center"/>
+            <w:tcBorders>
+              <w:top w:val="single" w:sz="4" w:color="D9D9D9"/>
+              <w:left w:val="single" w:sz="4" w:color="D9D9D9"/>
+              <w:bottom w:val="single" w:sz="4" w:color="D9D9D9"/>
+              <w:right w:val="single" w:sz="4" w:color="D9D9D9"/>
+              <w:insideH w:val="single" w:sz="4" w:color="D9D9D9"/>
+              <w:insideV w:val="single" w:sz="4" w:color="D9D9D9"/>
+            </w:tcBorders>
+            <w:shd w:fill="17365D"/>
+          </w:tcPr>
+          <w:p>
+            <w:pPr>
+              <w:spacing w:after="0" w:before="0"/>
+              <w:jc w:val="center"/>
+            </w:pPr>
+            <w:r>
+              <w:rPr>
+                <w:color w:val="FFFFFF"/>
+              </w:rPr>
+            </w:r>
+            <w:r>
+              <w:rPr>
+                <w:rFonts w:ascii="Aptos" w:hAnsi="Aptos"/>
+                <w:b/>
+                <w:color w:val="FFFFFF"/>
+                <w:sz w:val="19"/>
               </w:rPr>
               <w:t>N.º</w:t>
             </w:r>
@@ -786,16 +1878,34 @@
         </w:tc>
         <w:tc>
           <w:tcPr>
-            <w:tcW w:type="dxa" w:w="1080"/>
-            <w:shd w:val="clear" w:color="auto" w:fill="6B1F2A"/>
+            <w:tcW w:type="dxa" w:w="1008"/>
+            <w:vAlign w:val="center"/>
+            <w:tcBorders>
+              <w:top w:val="single" w:sz="4" w:color="D9D9D9"/>
+              <w:left w:val="single" w:sz="4" w:color="D9D9D9"/>
+              <w:bottom w:val="single" w:sz="4" w:color="D9D9D9"/>
+              <w:right w:val="single" w:sz="4" w:color="D9D9D9"/>
+              <w:insideH w:val="single" w:sz="4" w:color="D9D9D9"/>
+              <w:insideV w:val="single" w:sz="4" w:color="D9D9D9"/>
+            </w:tcBorders>
+            <w:shd w:fill="17365D"/>
           </w:tcPr>
           <w:p>
-            <w:r/>
+            <w:pPr>
+              <w:spacing w:after="0" w:before="0"/>
+              <w:jc w:val="center"/>
+            </w:pPr>
             <w:r>
               <w:rPr>
+                <w:color w:val="FFFFFF"/>
+              </w:rPr>
+            </w:r>
+            <w:r>
+              <w:rPr>
+                <w:rFonts w:ascii="Aptos" w:hAnsi="Aptos"/>
                 <w:b/>
                 <w:color w:val="FFFFFF"/>
-                <w:sz w:val="20"/>
+                <w:sz w:val="19"/>
               </w:rPr>
               <w:t>Fecha</w:t>
             </w:r>
@@ -803,16 +1913,34 @@
         </w:tc>
         <w:tc>
           <w:tcPr>
-            <w:tcW w:type="dxa" w:w="1080"/>
-            <w:shd w:val="clear" w:color="auto" w:fill="6B1F2A"/>
+            <w:tcW w:type="dxa" w:w="2088"/>
+            <w:vAlign w:val="center"/>
+            <w:tcBorders>
+              <w:top w:val="single" w:sz="4" w:color="D9D9D9"/>
+              <w:left w:val="single" w:sz="4" w:color="D9D9D9"/>
+              <w:bottom w:val="single" w:sz="4" w:color="D9D9D9"/>
+              <w:right w:val="single" w:sz="4" w:color="D9D9D9"/>
+              <w:insideH w:val="single" w:sz="4" w:color="D9D9D9"/>
+              <w:insideV w:val="single" w:sz="4" w:color="D9D9D9"/>
+            </w:tcBorders>
+            <w:shd w:fill="17365D"/>
           </w:tcPr>
           <w:p>
-            <w:r/>
+            <w:pPr>
+              <w:spacing w:after="0" w:before="0"/>
+              <w:jc w:val="center"/>
+            </w:pPr>
             <w:r>
               <w:rPr>
+                <w:color w:val="FFFFFF"/>
+              </w:rPr>
+            </w:r>
+            <w:r>
+              <w:rPr>
+                <w:rFonts w:ascii="Aptos" w:hAnsi="Aptos"/>
                 <w:b/>
                 <w:color w:val="FFFFFF"/>
-                <w:sz w:val="20"/>
+                <w:sz w:val="19"/>
               </w:rPr>
               <w:t>Descripción</w:t>
             </w:r>
@@ -820,33 +1948,69 @@
         </w:tc>
         <w:tc>
           <w:tcPr>
-            <w:tcW w:type="dxa" w:w="1080"/>
-            <w:shd w:val="clear" w:color="auto" w:fill="6B1F2A"/>
+            <w:tcW w:type="dxa" w:w="1224"/>
+            <w:vAlign w:val="center"/>
+            <w:tcBorders>
+              <w:top w:val="single" w:sz="4" w:color="D9D9D9"/>
+              <w:left w:val="single" w:sz="4" w:color="D9D9D9"/>
+              <w:bottom w:val="single" w:sz="4" w:color="D9D9D9"/>
+              <w:right w:val="single" w:sz="4" w:color="D9D9D9"/>
+              <w:insideH w:val="single" w:sz="4" w:color="D9D9D9"/>
+              <w:insideV w:val="single" w:sz="4" w:color="D9D9D9"/>
+            </w:tcBorders>
+            <w:shd w:fill="17365D"/>
           </w:tcPr>
           <w:p>
-            <w:r/>
+            <w:pPr>
+              <w:spacing w:after="0" w:before="0"/>
+              <w:jc w:val="center"/>
+            </w:pPr>
             <w:r>
               <w:rPr>
+                <w:color w:val="FFFFFF"/>
+              </w:rPr>
+            </w:r>
+            <w:r>
+              <w:rPr>
+                <w:rFonts w:ascii="Aptos" w:hAnsi="Aptos"/>
                 <w:b/>
                 <w:color w:val="FFFFFF"/>
-                <w:sz w:val="20"/>
+                <w:sz w:val="19"/>
               </w:rPr>
-              <w:t>Partes involucradas</w:t>
+              <w:t>Partes</w:t>
             </w:r>
           </w:p>
         </w:tc>
         <w:tc>
           <w:tcPr>
-            <w:tcW w:type="dxa" w:w="1080"/>
-            <w:shd w:val="clear" w:color="auto" w:fill="6B1F2A"/>
+            <w:tcW w:type="dxa" w:w="1008"/>
+            <w:vAlign w:val="center"/>
+            <w:tcBorders>
+              <w:top w:val="single" w:sz="4" w:color="D9D9D9"/>
+              <w:left w:val="single" w:sz="4" w:color="D9D9D9"/>
+              <w:bottom w:val="single" w:sz="4" w:color="D9D9D9"/>
+              <w:right w:val="single" w:sz="4" w:color="D9D9D9"/>
+              <w:insideH w:val="single" w:sz="4" w:color="D9D9D9"/>
+              <w:insideV w:val="single" w:sz="4" w:color="D9D9D9"/>
+            </w:tcBorders>
+            <w:shd w:fill="17365D"/>
           </w:tcPr>
           <w:p>
-            <w:r/>
+            <w:pPr>
+              <w:spacing w:after="0" w:before="0"/>
+              <w:jc w:val="center"/>
+            </w:pPr>
             <w:r>
               <w:rPr>
+                <w:color w:val="FFFFFF"/>
+              </w:rPr>
+            </w:r>
+            <w:r>
+              <w:rPr>
+                <w:rFonts w:ascii="Aptos" w:hAnsi="Aptos"/>
                 <w:b/>
                 <w:color w:val="FFFFFF"/>
-                <w:sz w:val="20"/>
+                <w:sz w:val="19"/>
               </w:rPr>
               <w:t>Tipo</w:t>
             </w:r>
@@ -854,50 +2018,104 @@
         </w:tc>
         <w:tc>
           <w:tcPr>
-            <w:tcW w:type="dxa" w:w="1080"/>
-            <w:shd w:val="clear" w:color="auto" w:fill="6B1F2A"/>
+            <w:tcW w:type="dxa" w:w="720"/>
+            <w:vAlign w:val="center"/>
+            <w:tcBorders>
+              <w:top w:val="single" w:sz="4" w:color="D9D9D9"/>
+              <w:left w:val="single" w:sz="4" w:color="D9D9D9"/>
+              <w:bottom w:val="single" w:sz="4" w:color="D9D9D9"/>
+              <w:right w:val="single" w:sz="4" w:color="D9D9D9"/>
+              <w:insideH w:val="single" w:sz="4" w:color="D9D9D9"/>
+              <w:insideV w:val="single" w:sz="4" w:color="D9D9D9"/>
+            </w:tcBorders>
+            <w:shd w:fill="17365D"/>
           </w:tcPr>
           <w:p>
-            <w:r/>
+            <w:pPr>
+              <w:spacing w:after="0" w:before="0"/>
+              <w:jc w:val="center"/>
+            </w:pPr>
             <w:r>
               <w:rPr>
+                <w:color w:val="FFFFFF"/>
+              </w:rPr>
+            </w:r>
+            <w:r>
+              <w:rPr>
+                <w:rFonts w:ascii="Aptos" w:hAnsi="Aptos"/>
                 <w:b/>
                 <w:color w:val="FFFFFF"/>
-                <w:sz w:val="20"/>
+                <w:sz w:val="19"/>
               </w:rPr>
-              <w:t>Nivel alcanzado</w:t>
+              <w:t>Nivel</w:t>
             </w:r>
           </w:p>
         </w:tc>
         <w:tc>
           <w:tcPr>
-            <w:tcW w:type="dxa" w:w="1080"/>
-            <w:shd w:val="clear" w:color="auto" w:fill="6B1F2A"/>
+            <w:tcW w:type="dxa" w:w="2160"/>
+            <w:vAlign w:val="center"/>
+            <w:tcBorders>
+              <w:top w:val="single" w:sz="4" w:color="D9D9D9"/>
+              <w:left w:val="single" w:sz="4" w:color="D9D9D9"/>
+              <w:bottom w:val="single" w:sz="4" w:color="D9D9D9"/>
+              <w:right w:val="single" w:sz="4" w:color="D9D9D9"/>
+              <w:insideH w:val="single" w:sz="4" w:color="D9D9D9"/>
+              <w:insideV w:val="single" w:sz="4" w:color="D9D9D9"/>
+            </w:tcBorders>
+            <w:shd w:fill="17365D"/>
           </w:tcPr>
           <w:p>
-            <w:r/>
+            <w:pPr>
+              <w:spacing w:after="0" w:before="0"/>
+              <w:jc w:val="center"/>
+            </w:pPr>
             <w:r>
               <w:rPr>
+                <w:color w:val="FFFFFF"/>
+              </w:rPr>
+            </w:r>
+            <w:r>
+              <w:rPr>
+                <w:rFonts w:ascii="Aptos" w:hAnsi="Aptos"/>
                 <w:b/>
                 <w:color w:val="FFFFFF"/>
-                <w:sz w:val="20"/>
+                <w:sz w:val="19"/>
               </w:rPr>
-              <w:t>Resolución / acuerdo</w:t>
+              <w:t>Resolución o acuerdo</w:t>
             </w:r>
           </w:p>
         </w:tc>
         <w:tc>
           <w:tcPr>
-            <w:tcW w:type="dxa" w:w="1080"/>
-            <w:shd w:val="clear" w:color="auto" w:fill="6B1F2A"/>
+            <w:tcW w:type="dxa" w:w="864"/>
+            <w:vAlign w:val="center"/>
+            <w:tcBorders>
+              <w:top w:val="single" w:sz="4" w:color="D9D9D9"/>
+              <w:left w:val="single" w:sz="4" w:color="D9D9D9"/>
+              <w:bottom w:val="single" w:sz="4" w:color="D9D9D9"/>
+              <w:right w:val="single" w:sz="4" w:color="D9D9D9"/>
+              <w:insideH w:val="single" w:sz="4" w:color="D9D9D9"/>
+              <w:insideV w:val="single" w:sz="4" w:color="D9D9D9"/>
+            </w:tcBorders>
+            <w:shd w:fill="17365D"/>
           </w:tcPr>
           <w:p>
-            <w:r/>
+            <w:pPr>
+              <w:spacing w:after="0" w:before="0"/>
+              <w:jc w:val="center"/>
+            </w:pPr>
             <w:r>
               <w:rPr>
+                <w:color w:val="FFFFFF"/>
+              </w:rPr>
+            </w:r>
+            <w:r>
+              <w:rPr>
+                <w:rFonts w:ascii="Aptos" w:hAnsi="Aptos"/>
                 <w:b/>
                 <w:color w:val="FFFFFF"/>
-                <w:sz w:val="20"/>
+                <w:sz w:val="19"/>
               </w:rPr>
               <w:t>Estado</w:t>
             </w:r>
@@ -905,256 +2123,275 @@
         </w:tc>
       </w:tr>
       <w:tr>
+        <w:trPr>
+          <w:cantSplit/>
+        </w:trPr>
         <w:tc>
           <w:tcPr>
-            <w:tcW w:type="dxa" w:w="1080"/>
+            <w:tcW w:type="dxa" w:w="504"/>
+            <w:vAlign w:val="center"/>
+            <w:tcBorders>
+              <w:top w:val="single" w:sz="4" w:color="D9D9D9"/>
+              <w:left w:val="single" w:sz="4" w:color="D9D9D9"/>
+              <w:bottom w:val="single" w:sz="4" w:color="D9D9D9"/>
+              <w:right w:val="single" w:sz="4" w:color="D9D9D9"/>
+              <w:insideH w:val="single" w:sz="4" w:color="D9D9D9"/>
+              <w:insideV w:val="single" w:sz="4" w:color="D9D9D9"/>
+            </w:tcBorders>
           </w:tcPr>
           <w:p>
+            <w:pPr>
+              <w:spacing w:after="0" w:before="0"/>
+              <w:jc w:val="center"/>
+            </w:pPr>
             <w:r/>
             <w:r>
               <w:rPr>
+                <w:rFonts w:ascii="Aptos" w:hAnsi="Aptos"/>
                 <w:b w:val="0"/>
-                <w:sz w:val="20"/>
+                <w:sz w:val="19"/>
               </w:rPr>
-              <w:t>1</w:t>
+              <w:t>N/A</w:t>
             </w:r>
           </w:p>
         </w:tc>
         <w:tc>
           <w:tcPr>
-            <w:tcW w:type="dxa" w:w="1080"/>
+            <w:tcW w:type="dxa" w:w="1008"/>
+            <w:vAlign w:val="center"/>
+            <w:tcBorders>
+              <w:top w:val="single" w:sz="4" w:color="D9D9D9"/>
+              <w:left w:val="single" w:sz="4" w:color="D9D9D9"/>
+              <w:bottom w:val="single" w:sz="4" w:color="D9D9D9"/>
+              <w:right w:val="single" w:sz="4" w:color="D9D9D9"/>
+              <w:insideH w:val="single" w:sz="4" w:color="D9D9D9"/>
+              <w:insideV w:val="single" w:sz="4" w:color="D9D9D9"/>
+            </w:tcBorders>
           </w:tcPr>
           <w:p>
+            <w:pPr>
+              <w:spacing w:after="0" w:before="0"/>
+              <w:jc w:val="left"/>
+            </w:pPr>
             <w:r/>
             <w:r>
               <w:rPr>
+                <w:rFonts w:ascii="Aptos" w:hAnsi="Aptos"/>
                 <w:b w:val="0"/>
-                <w:sz w:val="20"/>
+                <w:sz w:val="19"/>
               </w:rPr>
+              <w:t>Al 11/09/2026</w:t>
             </w:r>
           </w:p>
         </w:tc>
         <w:tc>
           <w:tcPr>
-            <w:tcW w:type="dxa" w:w="1080"/>
+            <w:tcW w:type="dxa" w:w="2088"/>
+            <w:vAlign w:val="center"/>
+            <w:tcBorders>
+              <w:top w:val="single" w:sz="4" w:color="D9D9D9"/>
+              <w:left w:val="single" w:sz="4" w:color="D9D9D9"/>
+              <w:bottom w:val="single" w:sz="4" w:color="D9D9D9"/>
+              <w:right w:val="single" w:sz="4" w:color="D9D9D9"/>
+              <w:insideH w:val="single" w:sz="4" w:color="D9D9D9"/>
+              <w:insideV w:val="single" w:sz="4" w:color="D9D9D9"/>
+            </w:tcBorders>
           </w:tcPr>
           <w:p>
+            <w:pPr>
+              <w:spacing w:after="0" w:before="0"/>
+              <w:jc w:val="left"/>
+            </w:pPr>
             <w:r/>
             <w:r>
               <w:rPr>
+                <w:rFonts w:ascii="Aptos" w:hAnsi="Aptos"/>
                 <w:b w:val="0"/>
-                <w:sz w:val="20"/>
+                <w:sz w:val="19"/>
               </w:rPr>
+              <w:t>No se han reportado conflictos.</w:t>
             </w:r>
           </w:p>
         </w:tc>
         <w:tc>
           <w:tcPr>
-            <w:tcW w:type="dxa" w:w="1080"/>
+            <w:tcW w:type="dxa" w:w="1224"/>
+            <w:vAlign w:val="center"/>
+            <w:tcBorders>
+              <w:top w:val="single" w:sz="4" w:color="D9D9D9"/>
+              <w:left w:val="single" w:sz="4" w:color="D9D9D9"/>
+              <w:bottom w:val="single" w:sz="4" w:color="D9D9D9"/>
+              <w:right w:val="single" w:sz="4" w:color="D9D9D9"/>
+              <w:insideH w:val="single" w:sz="4" w:color="D9D9D9"/>
+              <w:insideV w:val="single" w:sz="4" w:color="D9D9D9"/>
+            </w:tcBorders>
           </w:tcPr>
           <w:p>
+            <w:pPr>
+              <w:spacing w:after="0" w:before="0"/>
+              <w:jc w:val="left"/>
+            </w:pPr>
             <w:r/>
             <w:r>
               <w:rPr>
+                <w:rFonts w:ascii="Aptos" w:hAnsi="Aptos"/>
                 <w:b w:val="0"/>
-                <w:sz w:val="20"/>
+                <w:sz w:val="19"/>
               </w:rPr>
+              <w:t>Equipo</w:t>
             </w:r>
           </w:p>
         </w:tc>
         <w:tc>
           <w:tcPr>
-            <w:tcW w:type="dxa" w:w="1080"/>
+            <w:tcW w:type="dxa" w:w="1008"/>
+            <w:vAlign w:val="center"/>
+            <w:tcBorders>
+              <w:top w:val="single" w:sz="4" w:color="D9D9D9"/>
+              <w:left w:val="single" w:sz="4" w:color="D9D9D9"/>
+              <w:bottom w:val="single" w:sz="4" w:color="D9D9D9"/>
+              <w:right w:val="single" w:sz="4" w:color="D9D9D9"/>
+              <w:insideH w:val="single" w:sz="4" w:color="D9D9D9"/>
+              <w:insideV w:val="single" w:sz="4" w:color="D9D9D9"/>
+            </w:tcBorders>
           </w:tcPr>
           <w:p>
+            <w:pPr>
+              <w:spacing w:after="0" w:before="0"/>
+              <w:jc w:val="left"/>
+            </w:pPr>
             <w:r/>
             <w:r>
               <w:rPr>
+                <w:rFonts w:ascii="Aptos" w:hAnsi="Aptos"/>
                 <w:b w:val="0"/>
-                <w:sz w:val="20"/>
+                <w:sz w:val="19"/>
               </w:rPr>
+              <w:t>No aplica</w:t>
             </w:r>
           </w:p>
         </w:tc>
         <w:tc>
           <w:tcPr>
-            <w:tcW w:type="dxa" w:w="1080"/>
+            <w:tcW w:type="dxa" w:w="720"/>
+            <w:vAlign w:val="center"/>
+            <w:tcBorders>
+              <w:top w:val="single" w:sz="4" w:color="D9D9D9"/>
+              <w:left w:val="single" w:sz="4" w:color="D9D9D9"/>
+              <w:bottom w:val="single" w:sz="4" w:color="D9D9D9"/>
+              <w:right w:val="single" w:sz="4" w:color="D9D9D9"/>
+              <w:insideH w:val="single" w:sz="4" w:color="D9D9D9"/>
+              <w:insideV w:val="single" w:sz="4" w:color="D9D9D9"/>
+            </w:tcBorders>
           </w:tcPr>
           <w:p>
+            <w:pPr>
+              <w:spacing w:after="0" w:before="0"/>
+              <w:jc w:val="left"/>
+            </w:pPr>
             <w:r/>
             <w:r>
               <w:rPr>
+                <w:rFonts w:ascii="Aptos" w:hAnsi="Aptos"/>
                 <w:b w:val="0"/>
-                <w:sz w:val="20"/>
+                <w:sz w:val="19"/>
               </w:rPr>
+              <w:t>No aplica</w:t>
             </w:r>
           </w:p>
         </w:tc>
         <w:tc>
           <w:tcPr>
-            <w:tcW w:type="dxa" w:w="1080"/>
+            <w:tcW w:type="dxa" w:w="2160"/>
+            <w:vAlign w:val="center"/>
+            <w:tcBorders>
+              <w:top w:val="single" w:sz="4" w:color="D9D9D9"/>
+              <w:left w:val="single" w:sz="4" w:color="D9D9D9"/>
+              <w:bottom w:val="single" w:sz="4" w:color="D9D9D9"/>
+              <w:right w:val="single" w:sz="4" w:color="D9D9D9"/>
+              <w:insideH w:val="single" w:sz="4" w:color="D9D9D9"/>
+              <w:insideV w:val="single" w:sz="4" w:color="D9D9D9"/>
+            </w:tcBorders>
           </w:tcPr>
           <w:p>
+            <w:pPr>
+              <w:spacing w:after="0" w:before="0"/>
+              <w:jc w:val="left"/>
+            </w:pPr>
             <w:r/>
             <w:r>
               <w:rPr>
+                <w:rFonts w:ascii="Aptos" w:hAnsi="Aptos"/>
                 <w:b w:val="0"/>
-                <w:sz w:val="20"/>
+                <w:sz w:val="19"/>
               </w:rPr>
+              <w:t>No aplica</w:t>
             </w:r>
           </w:p>
         </w:tc>
         <w:tc>
           <w:tcPr>
-            <w:tcW w:type="dxa" w:w="1080"/>
+            <w:tcW w:type="dxa" w:w="864"/>
+            <w:vAlign w:val="center"/>
+            <w:tcBorders>
+              <w:top w:val="single" w:sz="4" w:color="D9D9D9"/>
+              <w:left w:val="single" w:sz="4" w:color="D9D9D9"/>
+              <w:bottom w:val="single" w:sz="4" w:color="D9D9D9"/>
+              <w:right w:val="single" w:sz="4" w:color="D9D9D9"/>
+              <w:insideH w:val="single" w:sz="4" w:color="D9D9D9"/>
+              <w:insideV w:val="single" w:sz="4" w:color="D9D9D9"/>
+            </w:tcBorders>
           </w:tcPr>
           <w:p>
+            <w:pPr>
+              <w:spacing w:after="0" w:before="0"/>
+              <w:jc w:val="left"/>
+            </w:pPr>
             <w:r/>
             <w:r>
               <w:rPr>
+                <w:rFonts w:ascii="Aptos" w:hAnsi="Aptos"/>
                 <w:b w:val="0"/>
-                <w:sz w:val="20"/>
+                <w:sz w:val="19"/>
               </w:rPr>
-            </w:r>
-          </w:p>
-        </w:tc>
-      </w:tr>
-      <w:tr>
-        <w:tc>
-          <w:tcPr>
-            <w:tcW w:type="dxa" w:w="1080"/>
-          </w:tcPr>
-          <w:p>
-            <w:r/>
-            <w:r>
-              <w:rPr>
-                <w:b w:val="0"/>
-                <w:sz w:val="20"/>
-              </w:rPr>
-              <w:t>2</w:t>
-            </w:r>
-          </w:p>
-        </w:tc>
-        <w:tc>
-          <w:tcPr>
-            <w:tcW w:type="dxa" w:w="1080"/>
-          </w:tcPr>
-          <w:p>
-            <w:r/>
-            <w:r>
-              <w:rPr>
-                <w:b w:val="0"/>
-                <w:sz w:val="20"/>
-              </w:rPr>
-            </w:r>
-          </w:p>
-        </w:tc>
-        <w:tc>
-          <w:tcPr>
-            <w:tcW w:type="dxa" w:w="1080"/>
-          </w:tcPr>
-          <w:p>
-            <w:r/>
-            <w:r>
-              <w:rPr>
-                <w:b w:val="0"/>
-                <w:sz w:val="20"/>
-              </w:rPr>
-            </w:r>
-          </w:p>
-        </w:tc>
-        <w:tc>
-          <w:tcPr>
-            <w:tcW w:type="dxa" w:w="1080"/>
-          </w:tcPr>
-          <w:p>
-            <w:r/>
-            <w:r>
-              <w:rPr>
-                <w:b w:val="0"/>
-                <w:sz w:val="20"/>
-              </w:rPr>
-            </w:r>
-          </w:p>
-        </w:tc>
-        <w:tc>
-          <w:tcPr>
-            <w:tcW w:type="dxa" w:w="1080"/>
-          </w:tcPr>
-          <w:p>
-            <w:r/>
-            <w:r>
-              <w:rPr>
-                <w:b w:val="0"/>
-                <w:sz w:val="20"/>
-              </w:rPr>
-            </w:r>
-          </w:p>
-        </w:tc>
-        <w:tc>
-          <w:tcPr>
-            <w:tcW w:type="dxa" w:w="1080"/>
-          </w:tcPr>
-          <w:p>
-            <w:r/>
-            <w:r>
-              <w:rPr>
-                <w:b w:val="0"/>
-                <w:sz w:val="20"/>
-              </w:rPr>
-            </w:r>
-          </w:p>
-        </w:tc>
-        <w:tc>
-          <w:tcPr>
-            <w:tcW w:type="dxa" w:w="1080"/>
-          </w:tcPr>
-          <w:p>
-            <w:r/>
-            <w:r>
-              <w:rPr>
-                <w:b w:val="0"/>
-                <w:sz w:val="20"/>
-              </w:rPr>
-            </w:r>
-          </w:p>
-        </w:tc>
-        <w:tc>
-          <w:tcPr>
-            <w:tcW w:type="dxa" w:w="1080"/>
-          </w:tcPr>
-          <w:p>
-            <w:r/>
-            <w:r>
-              <w:rPr>
-                <w:b w:val="0"/>
-                <w:sz w:val="20"/>
-              </w:rPr>
+              <w:t>Sin conflictos</w:t>
             </w:r>
           </w:p>
         </w:tc>
       </w:tr>
     </w:tbl>
-    <w:p/>
-    <w:p/>
     <w:p>
-      <w:r>
-        <w:rPr>
-          <w:i/>
-          <w:color w:val="6B5A48"/>
-          <w:sz w:val="18"/>
-        </w:rPr>
-        <w:t>Este documento define el protocolo de resolución de conflictos del equipo. La tabla de la sección 5 se completa únicamente cuando ocurre un conflicto real; no se han registrado conflictos hasta la fecha de preparación de este documento.</w:t>
-      </w:r>
+      <w:pPr>
+        <w:spacing w:after="40"/>
+      </w:pPr>
     </w:p>
     <w:sectPr>
+      <w:footerReference w:type="default" r:id="rId9"/>
       <w:pgSz w:w="12240" w:h="15840"/>
-      <w:pgMar w:top="1440" w:right="1800" w:bottom="1440" w:left="1800" w:header="720" w:footer="720" w:gutter="0"/>
+      <w:pgMar w:top="1008" w:right="1008" w:bottom="1008" w:left="1008" w:header="720" w:footer="720" w:gutter="0"/>
       <w:cols w:space="720"/>
       <w:docGrid w:linePitch="360"/>
     </w:sectPr>
   </w:body>
 </w:document>
+</file>
+
+<file path=word/footer1.xml><?xml version="1.0" encoding="utf-8"?>
+<w:ftr xmlns:m="http://schemas.openxmlformats.org/officeDocument/2006/math" xmlns:mc="http://schemas.openxmlformats.org/markup-compatibility/2006" xmlns:mo="http://schemas.microsoft.com/office/mac/office/2008/main" xmlns:mv="urn:schemas-microsoft-com:mac:vml" xmlns:o="urn:schemas-microsoft-com:office:office" xmlns:r="http://schemas.openxmlformats.org/officeDocument/2006/relationships" xmlns:v="urn:schemas-microsoft-com:vml" xmlns:w10="urn:schemas-microsoft-com:office:word" xmlns:w14="http://schemas.microsoft.com/office/word/2010/wordml" xmlns:w="http://schemas.openxmlformats.org/wordprocessingml/2006/main" xmlns:wne="http://schemas.microsoft.com/office/word/2006/wordml" xmlns:wp14="http://schemas.microsoft.com/office/word/2010/wordprocessingDrawing" xmlns:wp="http://schemas.openxmlformats.org/drawingml/2006/wordprocessingDrawing" xmlns:wpc="http://schemas.microsoft.com/office/word/2010/wordprocessingCanvas" xmlns:wpg="http://schemas.microsoft.com/office/word/2010/wordprocessingGroup" xmlns:wpi="http://schemas.microsoft.com/office/word/2010/wordprocessingInk" xmlns:wps="http://schemas.microsoft.com/office/word/2010/wordprocessingShape" mc:Ignorable="w14 wp14">
+  <w:p>
+    <w:pPr>
+      <w:pStyle w:val="Footer"/>
+      <w:jc w:val="center"/>
+    </w:pPr>
+    <w:r>
+      <w:rPr>
+        <w:color w:val="595959"/>
+        <w:sz w:val="16"/>
+      </w:rPr>
+      <w:t>LEX-CORPUS  |  Documento de gestión del proyecto</w:t>
+    </w:r>
+  </w:p>
+</w:ftr>
 </file>
 
 <file path=word/numbering.xml><?xml version="1.0" encoding="utf-8"?>
@@ -1520,6 +2757,13 @@
     <w:name w:val="Normal"/>
     <w:qFormat/>
     <w:rsid w:val="00FC693F"/>
+    <w:pPr>
+      <w:spacing w:after="120"/>
+    </w:pPr>
+    <w:rPr>
+      <w:rFonts w:ascii="Aptos" w:hAnsi="Aptos"/>
+      <w:sz w:val="21"/>
+    </w:rPr>
   </w:style>
   <w:style w:type="paragraph" w:styleId="Header">
     <w:name w:val="header"/>
@@ -1576,14 +2820,14 @@
     <w:pPr>
       <w:keepNext/>
       <w:keepLines/>
-      <w:spacing w:before="480" w:after="0"/>
+      <w:spacing w:before="240" w:after="120"/>
       <w:outlineLvl w:val="0"/>
     </w:pPr>
     <w:rPr>
-      <w:rFonts w:asciiTheme="majorHAnsi" w:eastAsiaTheme="majorEastAsia" w:hAnsiTheme="majorHAnsi" w:cstheme="majorBidi"/>
+      <w:rFonts w:asciiTheme="majorHAnsi" w:eastAsiaTheme="majorEastAsia" w:hAnsiTheme="majorHAnsi" w:cstheme="majorBidi" w:ascii="Aptos Display" w:hAnsi="Aptos Display"/>
       <w:b/>
       <w:bCs/>
-      <w:color w:val="365F91" w:themeColor="accent1" w:themeShade="BF"/>
+      <w:color w:val="000000"/>
       <w:sz w:val="28"/>
       <w:szCs w:val="28"/>
     </w:rPr>
@@ -1604,10 +2848,10 @@
       <w:outlineLvl w:val="1"/>
     </w:pPr>
     <w:rPr>
-      <w:rFonts w:asciiTheme="majorHAnsi" w:eastAsiaTheme="majorEastAsia" w:hAnsiTheme="majorHAnsi" w:cstheme="majorBidi"/>
+      <w:rFonts w:asciiTheme="majorHAnsi" w:eastAsiaTheme="majorEastAsia" w:hAnsiTheme="majorHAnsi" w:cstheme="majorBidi" w:ascii="Aptos Display" w:hAnsi="Aptos Display"/>
       <w:b/>
       <w:bCs/>
-      <w:color w:val="4F81BD" w:themeColor="accent1"/>
+      <w:color w:val="000000"/>
       <w:sz w:val="26"/>
       <w:szCs w:val="26"/>
     </w:rPr>

</xml_diff>